<commit_message>
chore: unify script footers, fix docs (column_analysis.md, prepared_data 119 cols)
</commit_message>
<xml_diff>
--- a/reports/tft_report.docx
+++ b/reports/tft_report.docx
@@ -639,7 +639,7 @@
               <w:rPr>
                 <w:sz w:val="18"/>
               </w:rPr>
-              <w:t>21 + 8 sin/cos</w:t>
+              <w:t>20 + 8 sin/cos = 28</w:t>
             </w:r>
           </w:p>
         </w:tc>
@@ -2599,7 +2599,7 @@
               <w:rPr>
                 <w:sz w:val="18"/>
               </w:rPr>
-              <w:t>Z-score. log1p + _orig.</w:t>
+              <w:t>log1p + _orig. Z-score не применяется (в LOG_COLS — нормализует TorchNormalizer внутри TFT).</w:t>
               <w:br/>
               <w:t>Категории магазина (shop_напитки, shop_закуски, shop_автотовары,</w:t>
               <w:br/>
@@ -4710,7 +4710,7 @@
               <w:rPr>
                 <w:sz w:val="18"/>
               </w:rPr>
-              <w:t>hour (+sin/cos), day_of_week (+sin/cos), week_of_year (+sin/cos), month (+sin/cos), quarter, is_* (4), promotion_* (3), ad_active, price_* (7) — итого 29 колонок</w:t>
+              <w:t>hour (+sin/cos), day_of_week (+sin/cos), week_of_year (+sin/cos), month (+sin/cos), quarter, is_* (4), promotion_* (3), ad_active, price_* (7) — итого 28 колонок</w:t>
             </w:r>
           </w:p>
         </w:tc>

</xml_diff>

<commit_message>
feat(report): add section 5 — full variable table after preprocessing
- Section 5: table of all 93 model columns (static_cat/real, known_cat/real,
  observed past, targets) with source variable and applied transformation
- Section 5.1: summary count table per TFT role (total: 93 columns)
- Section 4.1: update hyperparameters to current values
  (dropout 0.15, lr 3e-4, gradient_clip 1.0, patience 12, hidden_continuous 64)

Co-Authored-By: Claude Sonnet 4.6 <noreply@anthropic.com>
</commit_message>
<xml_diff>
--- a/reports/tft_report.docx
+++ b/reports/tft_report.docx
@@ -4212,7 +4212,7 @@
               <w:rPr>
                 <w:sz w:val="18"/>
               </w:rPr>
-              <w:t>dropout</w:t>
+              <w:t>hidden_continuous_size</w:t>
             </w:r>
           </w:p>
         </w:tc>
@@ -4226,7 +4226,7 @@
               <w:rPr>
                 <w:sz w:val="18"/>
               </w:rPr>
-              <w:t>0.1</w:t>
+              <w:t>64</w:t>
             </w:r>
           </w:p>
         </w:tc>
@@ -4240,7 +4240,7 @@
               <w:rPr>
                 <w:sz w:val="18"/>
               </w:rPr>
-              <w:t>Регуляризация</w:t>
+              <w:t>Размер сети для числовых входов</w:t>
             </w:r>
           </w:p>
         </w:tc>
@@ -4256,7 +4256,7 @@
               <w:rPr>
                 <w:sz w:val="18"/>
               </w:rPr>
-              <w:t>learning_rate</w:t>
+              <w:t>dropout</w:t>
             </w:r>
           </w:p>
         </w:tc>
@@ -4270,7 +4270,7 @@
               <w:rPr>
                 <w:sz w:val="18"/>
               </w:rPr>
-              <w:t>1e-3</w:t>
+              <w:t>0.15</w:t>
             </w:r>
           </w:p>
         </w:tc>
@@ -4284,7 +4284,7 @@
               <w:rPr>
                 <w:sz w:val="18"/>
               </w:rPr>
-              <w:t>Начальный LR (ReduceOnPlateau)</w:t>
+              <w:t>Регуляризация</w:t>
             </w:r>
           </w:p>
         </w:tc>
@@ -4300,7 +4300,7 @@
               <w:rPr>
                 <w:sz w:val="18"/>
               </w:rPr>
-              <w:t>gradient_clip</w:t>
+              <w:t>learning_rate</w:t>
             </w:r>
           </w:p>
         </w:tc>
@@ -4314,7 +4314,7 @@
               <w:rPr>
                 <w:sz w:val="18"/>
               </w:rPr>
-              <w:t>0.1</w:t>
+              <w:t>3e-4</w:t>
             </w:r>
           </w:p>
         </w:tc>
@@ -4328,7 +4328,7 @@
               <w:rPr>
                 <w:sz w:val="18"/>
               </w:rPr>
-              <w:t>Обрезка градиентов</w:t>
+              <w:t>Начальный LR (ReduceOnPlateau, patience=5)</w:t>
             </w:r>
           </w:p>
         </w:tc>
@@ -4344,7 +4344,7 @@
               <w:rPr>
                 <w:sz w:val="18"/>
               </w:rPr>
-              <w:t>EarlyStopping</w:t>
+              <w:t>gradient_clip</w:t>
             </w:r>
           </w:p>
         </w:tc>
@@ -4358,7 +4358,7 @@
               <w:rPr>
                 <w:sz w:val="18"/>
               </w:rPr>
-              <w:t>patience=5</w:t>
+              <w:t>1.0</w:t>
             </w:r>
           </w:p>
         </w:tc>
@@ -4372,7 +4372,7 @@
               <w:rPr>
                 <w:sz w:val="18"/>
               </w:rPr>
-              <w:t>Останавливается при отсутствии улучшения</w:t>
+              <w:t>Обрезка градиентов</w:t>
             </w:r>
           </w:p>
         </w:tc>
@@ -4388,7 +4388,7 @@
               <w:rPr>
                 <w:sz w:val="18"/>
               </w:rPr>
-              <w:t>target_normalizer</w:t>
+              <w:t>EarlyStopping</w:t>
             </w:r>
           </w:p>
         </w:tc>
@@ -4402,7 +4402,7 @@
               <w:rPr>
                 <w:sz w:val="18"/>
               </w:rPr>
-              <w:t>TorchNormalizer(robust)</w:t>
+              <w:t>patience=12</w:t>
             </w:r>
           </w:p>
         </w:tc>
@@ -4410,6 +4410,50 @@
           <w:tcPr>
             <w:tcW w:type="dxa" w:w="5386"/>
             <w:shd w:fill="F2F2F2" w:val="clear"/>
+          </w:tcPr>
+          <w:p>
+            <w:r>
+              <w:rPr>
+                <w:sz w:val="18"/>
+              </w:rPr>
+              <w:t>Останавливается при отсутствии улучшения</w:t>
+            </w:r>
+          </w:p>
+        </w:tc>
+      </w:tr>
+      <w:tr>
+        <w:tc>
+          <w:tcPr>
+            <w:tcW w:type="dxa" w:w="2835"/>
+            <w:shd w:fill="FFFFFF" w:val="clear"/>
+          </w:tcPr>
+          <w:p>
+            <w:r>
+              <w:rPr>
+                <w:sz w:val="18"/>
+              </w:rPr>
+              <w:t>target_normalizer</w:t>
+            </w:r>
+          </w:p>
+        </w:tc>
+        <w:tc>
+          <w:tcPr>
+            <w:tcW w:type="dxa" w:w="2268"/>
+            <w:shd w:fill="FFFFFF" w:val="clear"/>
+          </w:tcPr>
+          <w:p>
+            <w:r>
+              <w:rPr>
+                <w:sz w:val="18"/>
+              </w:rPr>
+              <w:t>TorchNormalizer(robust)</w:t>
+            </w:r>
+          </w:p>
+        </w:tc>
+        <w:tc>
+          <w:tcPr>
+            <w:tcW w:type="dxa" w:w="5386"/>
+            <w:shd w:fill="FFFFFF" w:val="clear"/>
           </w:tcPr>
           <w:p>
             <w:r>
@@ -5568,6 +5612,3680 @@
         <w:t>Обратное преобразование прогноза (tft/predict.py): TorchNormalizer^-1 (mode='quantiles', автоматически) -&gt; expm1(x) -&gt; исходные единицы (литры/час для топлива, руб/ч для магазина).</w:t>
       </w:r>
     </w:p>
+    <w:p>
+      <w:pPr>
+        <w:pStyle w:val="Heading1"/>
+      </w:pPr>
+      <w:r>
+        <w:rPr>
+          <w:color w:val="1F3964"/>
+        </w:rPr>
+        <w:t>5. Итоговый состав переменных модели после предобработки</w:t>
+      </w:r>
+    </w:p>
+    <w:p>
+      <w:r>
+        <w:rPr>
+          <w:b w:val="0"/>
+          <w:i w:val="0"/>
+          <w:sz w:val="20"/>
+        </w:rPr>
+        <w:t>Таблица показывает, какие именно колонки подаются в TFT после всех шагов предобработки. Указаны применённые преобразования и роль в модели.</w:t>
+      </w:r>
+    </w:p>
+    <w:tbl>
+      <w:tblPr>
+        <w:tblStyle w:val="TableGrid"/>
+        <w:tblW w:type="auto" w:w="0"/>
+        <w:jc w:val="left"/>
+        <w:tblLook w:firstColumn="1" w:firstRow="1" w:lastColumn="0" w:lastRow="0" w:noHBand="0" w:noVBand="1" w:val="04A0"/>
+      </w:tblPr>
+      <w:tblGrid>
+        <w:gridCol w:w="2422"/>
+        <w:gridCol w:w="2422"/>
+        <w:gridCol w:w="2422"/>
+        <w:gridCol w:w="2422"/>
+      </w:tblGrid>
+      <w:tr>
+        <w:tc>
+          <w:tcPr>
+            <w:tcW w:type="dxa" w:w="2551"/>
+            <w:shd w:fill="1F3964" w:val="clear"/>
+          </w:tcPr>
+          <w:p>
+            <w:r>
+              <w:rPr>
+                <w:b/>
+                <w:color w:val="FFFFFF"/>
+                <w:sz w:val="18"/>
+              </w:rPr>
+              <w:t>Колонка в модели</w:t>
+            </w:r>
+          </w:p>
+        </w:tc>
+        <w:tc>
+          <w:tcPr>
+            <w:tcW w:type="dxa" w:w="2268"/>
+            <w:shd w:fill="1F3964" w:val="clear"/>
+          </w:tcPr>
+          <w:p>
+            <w:r>
+              <w:rPr>
+                <w:b/>
+                <w:color w:val="FFFFFF"/>
+                <w:sz w:val="18"/>
+              </w:rPr>
+              <w:t>Исходная переменная</w:t>
+            </w:r>
+          </w:p>
+        </w:tc>
+        <w:tc>
+          <w:tcPr>
+            <w:tcW w:type="dxa" w:w="2551"/>
+            <w:shd w:fill="1F3964" w:val="clear"/>
+          </w:tcPr>
+          <w:p>
+            <w:r>
+              <w:rPr>
+                <w:b/>
+                <w:color w:val="FFFFFF"/>
+                <w:sz w:val="18"/>
+              </w:rPr>
+              <w:t>Преобразование</w:t>
+            </w:r>
+          </w:p>
+        </w:tc>
+        <w:tc>
+          <w:tcPr>
+            <w:tcW w:type="dxa" w:w="3118"/>
+            <w:shd w:fill="1F3964" w:val="clear"/>
+          </w:tcPr>
+          <w:p>
+            <w:r>
+              <w:rPr>
+                <w:b/>
+                <w:color w:val="FFFFFF"/>
+                <w:sz w:val="18"/>
+              </w:rPr>
+              <w:t>TFT-роль</w:t>
+            </w:r>
+          </w:p>
+        </w:tc>
+      </w:tr>
+      <w:tr>
+        <w:tc>
+          <w:tcPr>
+            <w:tcW w:type="dxa" w:w="2551"/>
+            <w:shd w:fill="F2F2F2" w:val="clear"/>
+          </w:tcPr>
+          <w:p>
+            <w:r>
+              <w:rPr>
+                <w:sz w:val="18"/>
+              </w:rPr>
+              <w:t>road_type_enc</w:t>
+            </w:r>
+          </w:p>
+        </w:tc>
+        <w:tc>
+          <w:tcPr>
+            <w:tcW w:type="dxa" w:w="2268"/>
+            <w:shd w:fill="F2F2F2" w:val="clear"/>
+          </w:tcPr>
+          <w:p>
+            <w:r>
+              <w:rPr>
+                <w:sz w:val="18"/>
+              </w:rPr>
+              <w:t>road_type</w:t>
+            </w:r>
+          </w:p>
+        </w:tc>
+        <w:tc>
+          <w:tcPr>
+            <w:tcW w:type="dxa" w:w="2551"/>
+            <w:shd w:fill="F2F2F2" w:val="clear"/>
+          </w:tcPr>
+          <w:p>
+            <w:r>
+              <w:rPr>
+                <w:sz w:val="18"/>
+              </w:rPr>
+              <w:t>LabelEncoder</w:t>
+            </w:r>
+          </w:p>
+        </w:tc>
+        <w:tc>
+          <w:tcPr>
+            <w:tcW w:type="dxa" w:w="3118"/>
+            <w:shd w:fill="F2F2F2" w:val="clear"/>
+          </w:tcPr>
+          <w:p>
+            <w:r>
+              <w:rPr>
+                <w:sz w:val="18"/>
+              </w:rPr>
+              <w:t>static_categoricals</w:t>
+            </w:r>
+          </w:p>
+        </w:tc>
+      </w:tr>
+      <w:tr>
+        <w:tc>
+          <w:tcPr>
+            <w:tcW w:type="dxa" w:w="2551"/>
+            <w:shd w:fill="FFFFFF" w:val="clear"/>
+          </w:tcPr>
+          <w:p>
+            <w:r>
+              <w:rPr>
+                <w:sz w:val="18"/>
+              </w:rPr>
+              <w:t>direction_enc</w:t>
+            </w:r>
+          </w:p>
+        </w:tc>
+        <w:tc>
+          <w:tcPr>
+            <w:tcW w:type="dxa" w:w="2268"/>
+            <w:shd w:fill="FFFFFF" w:val="clear"/>
+          </w:tcPr>
+          <w:p>
+            <w:r>
+              <w:rPr>
+                <w:sz w:val="18"/>
+              </w:rPr>
+              <w:t>direction</w:t>
+            </w:r>
+          </w:p>
+        </w:tc>
+        <w:tc>
+          <w:tcPr>
+            <w:tcW w:type="dxa" w:w="2551"/>
+            <w:shd w:fill="FFFFFF" w:val="clear"/>
+          </w:tcPr>
+          <w:p>
+            <w:r>
+              <w:rPr>
+                <w:sz w:val="18"/>
+              </w:rPr>
+              <w:t>LabelEncoder</w:t>
+            </w:r>
+          </w:p>
+        </w:tc>
+        <w:tc>
+          <w:tcPr>
+            <w:tcW w:type="dxa" w:w="3118"/>
+            <w:shd w:fill="FFFFFF" w:val="clear"/>
+          </w:tcPr>
+          <w:p>
+            <w:r>
+              <w:rPr>
+                <w:sz w:val="18"/>
+              </w:rPr>
+              <w:t>static_categoricals</w:t>
+            </w:r>
+          </w:p>
+        </w:tc>
+      </w:tr>
+      <w:tr>
+        <w:tc>
+          <w:tcPr>
+            <w:tcW w:type="dxa" w:w="2551"/>
+            <w:shd w:fill="F2F2F2" w:val="clear"/>
+          </w:tcPr>
+          <w:p>
+            <w:r>
+              <w:rPr>
+                <w:sz w:val="18"/>
+              </w:rPr>
+              <w:t>settlement_size_enc</w:t>
+            </w:r>
+          </w:p>
+        </w:tc>
+        <w:tc>
+          <w:tcPr>
+            <w:tcW w:type="dxa" w:w="2268"/>
+            <w:shd w:fill="F2F2F2" w:val="clear"/>
+          </w:tcPr>
+          <w:p>
+            <w:r>
+              <w:rPr>
+                <w:sz w:val="18"/>
+              </w:rPr>
+              <w:t>settlement_size</w:t>
+            </w:r>
+          </w:p>
+        </w:tc>
+        <w:tc>
+          <w:tcPr>
+            <w:tcW w:type="dxa" w:w="2551"/>
+            <w:shd w:fill="F2F2F2" w:val="clear"/>
+          </w:tcPr>
+          <w:p>
+            <w:r>
+              <w:rPr>
+                <w:sz w:val="18"/>
+              </w:rPr>
+              <w:t>LabelEncoder</w:t>
+            </w:r>
+          </w:p>
+        </w:tc>
+        <w:tc>
+          <w:tcPr>
+            <w:tcW w:type="dxa" w:w="3118"/>
+            <w:shd w:fill="F2F2F2" w:val="clear"/>
+          </w:tcPr>
+          <w:p>
+            <w:r>
+              <w:rPr>
+                <w:sz w:val="18"/>
+              </w:rPr>
+              <w:t>static_categoricals</w:t>
+            </w:r>
+          </w:p>
+        </w:tc>
+      </w:tr>
+      <w:tr>
+        <w:tc>
+          <w:tcPr>
+            <w:tcW w:type="dxa" w:w="2551"/>
+            <w:shd w:fill="FFFFFF" w:val="clear"/>
+          </w:tcPr>
+          <w:p>
+            <w:r>
+              <w:rPr>
+                <w:sz w:val="18"/>
+              </w:rPr>
+              <w:t>distance_to_city_km</w:t>
+            </w:r>
+          </w:p>
+        </w:tc>
+        <w:tc>
+          <w:tcPr>
+            <w:tcW w:type="dxa" w:w="2268"/>
+            <w:shd w:fill="FFFFFF" w:val="clear"/>
+          </w:tcPr>
+          <w:p>
+            <w:r>
+              <w:rPr>
+                <w:sz w:val="18"/>
+              </w:rPr>
+              <w:t>distance_to_city_km</w:t>
+            </w:r>
+          </w:p>
+        </w:tc>
+        <w:tc>
+          <w:tcPr>
+            <w:tcW w:type="dxa" w:w="2551"/>
+            <w:shd w:fill="FFFFFF" w:val="clear"/>
+          </w:tcPr>
+          <w:p>
+            <w:r>
+              <w:rPr>
+                <w:sz w:val="18"/>
+              </w:rPr>
+              <w:t>—</w:t>
+            </w:r>
+          </w:p>
+        </w:tc>
+        <w:tc>
+          <w:tcPr>
+            <w:tcW w:type="dxa" w:w="3118"/>
+            <w:shd w:fill="FFFFFF" w:val="clear"/>
+          </w:tcPr>
+          <w:p>
+            <w:r>
+              <w:rPr>
+                <w:sz w:val="18"/>
+              </w:rPr>
+              <w:t>static_reals</w:t>
+            </w:r>
+          </w:p>
+        </w:tc>
+      </w:tr>
+      <w:tr>
+        <w:tc>
+          <w:tcPr>
+            <w:tcW w:type="dxa" w:w="2551"/>
+            <w:shd w:fill="F2F2F2" w:val="clear"/>
+          </w:tcPr>
+          <w:p>
+            <w:r>
+              <w:rPr>
+                <w:sz w:val="18"/>
+              </w:rPr>
+              <w:t>total_pumps</w:t>
+            </w:r>
+          </w:p>
+        </w:tc>
+        <w:tc>
+          <w:tcPr>
+            <w:tcW w:type="dxa" w:w="2268"/>
+            <w:shd w:fill="F2F2F2" w:val="clear"/>
+          </w:tcPr>
+          <w:p>
+            <w:r>
+              <w:rPr>
+                <w:sz w:val="18"/>
+              </w:rPr>
+              <w:t>total_pumps</w:t>
+            </w:r>
+          </w:p>
+        </w:tc>
+        <w:tc>
+          <w:tcPr>
+            <w:tcW w:type="dxa" w:w="2551"/>
+            <w:shd w:fill="F2F2F2" w:val="clear"/>
+          </w:tcPr>
+          <w:p>
+            <w:r>
+              <w:rPr>
+                <w:sz w:val="18"/>
+              </w:rPr>
+              <w:t>—</w:t>
+            </w:r>
+          </w:p>
+        </w:tc>
+        <w:tc>
+          <w:tcPr>
+            <w:tcW w:type="dxa" w:w="3118"/>
+            <w:shd w:fill="F2F2F2" w:val="clear"/>
+          </w:tcPr>
+          <w:p>
+            <w:r>
+              <w:rPr>
+                <w:sz w:val="18"/>
+              </w:rPr>
+              <w:t>static_reals</w:t>
+            </w:r>
+          </w:p>
+        </w:tc>
+      </w:tr>
+      <w:tr>
+        <w:tc>
+          <w:tcPr>
+            <w:tcW w:type="dxa" w:w="2551"/>
+            <w:shd w:fill="FFFFFF" w:val="clear"/>
+          </w:tcPr>
+          <w:p>
+            <w:r>
+              <w:rPr>
+                <w:sz w:val="18"/>
+              </w:rPr>
+              <w:t>shop_area_m2</w:t>
+            </w:r>
+          </w:p>
+        </w:tc>
+        <w:tc>
+          <w:tcPr>
+            <w:tcW w:type="dxa" w:w="2268"/>
+            <w:shd w:fill="FFFFFF" w:val="clear"/>
+          </w:tcPr>
+          <w:p>
+            <w:r>
+              <w:rPr>
+                <w:sz w:val="18"/>
+              </w:rPr>
+              <w:t>shop_area_m2</w:t>
+            </w:r>
+          </w:p>
+        </w:tc>
+        <w:tc>
+          <w:tcPr>
+            <w:tcW w:type="dxa" w:w="2551"/>
+            <w:shd w:fill="FFFFFF" w:val="clear"/>
+          </w:tcPr>
+          <w:p>
+            <w:r>
+              <w:rPr>
+                <w:sz w:val="18"/>
+              </w:rPr>
+              <w:t>—</w:t>
+            </w:r>
+          </w:p>
+        </w:tc>
+        <w:tc>
+          <w:tcPr>
+            <w:tcW w:type="dxa" w:w="3118"/>
+            <w:shd w:fill="FFFFFF" w:val="clear"/>
+          </w:tcPr>
+          <w:p>
+            <w:r>
+              <w:rPr>
+                <w:sz w:val="18"/>
+              </w:rPr>
+              <w:t>static_reals</w:t>
+            </w:r>
+          </w:p>
+        </w:tc>
+      </w:tr>
+      <w:tr>
+        <w:tc>
+          <w:tcPr>
+            <w:tcW w:type="dxa" w:w="2551"/>
+            <w:shd w:fill="F2F2F2" w:val="clear"/>
+          </w:tcPr>
+          <w:p>
+            <w:r>
+              <w:rPr>
+                <w:sz w:val="18"/>
+              </w:rPr>
+              <w:t>num_pumps_AI92/95/98 (3 к.)</w:t>
+            </w:r>
+          </w:p>
+        </w:tc>
+        <w:tc>
+          <w:tcPr>
+            <w:tcW w:type="dxa" w:w="2268"/>
+            <w:shd w:fill="F2F2F2" w:val="clear"/>
+          </w:tcPr>
+          <w:p>
+            <w:r>
+              <w:rPr>
+                <w:sz w:val="18"/>
+              </w:rPr>
+              <w:t>num_pumps_AI92/95/98</w:t>
+            </w:r>
+          </w:p>
+        </w:tc>
+        <w:tc>
+          <w:tcPr>
+            <w:tcW w:type="dxa" w:w="2551"/>
+            <w:shd w:fill="F2F2F2" w:val="clear"/>
+          </w:tcPr>
+          <w:p>
+            <w:r>
+              <w:rPr>
+                <w:sz w:val="18"/>
+              </w:rPr>
+              <w:t>— (3 колонки)</w:t>
+            </w:r>
+          </w:p>
+        </w:tc>
+        <w:tc>
+          <w:tcPr>
+            <w:tcW w:type="dxa" w:w="3118"/>
+            <w:shd w:fill="F2F2F2" w:val="clear"/>
+          </w:tcPr>
+          <w:p>
+            <w:r>
+              <w:rPr>
+                <w:sz w:val="18"/>
+              </w:rPr>
+              <w:t>static_reals</w:t>
+            </w:r>
+          </w:p>
+        </w:tc>
+      </w:tr>
+      <w:tr>
+        <w:tc>
+          <w:tcPr>
+            <w:tcW w:type="dxa" w:w="2551"/>
+            <w:shd w:fill="FFFFFF" w:val="clear"/>
+          </w:tcPr>
+          <w:p>
+            <w:r>
+              <w:rPr>
+                <w:sz w:val="18"/>
+              </w:rPr>
+              <w:t>num_pumps_DT_* (4 к.)</w:t>
+            </w:r>
+          </w:p>
+        </w:tc>
+        <w:tc>
+          <w:tcPr>
+            <w:tcW w:type="dxa" w:w="2268"/>
+            <w:shd w:fill="FFFFFF" w:val="clear"/>
+          </w:tcPr>
+          <w:p>
+            <w:r>
+              <w:rPr>
+                <w:sz w:val="18"/>
+              </w:rPr>
+              <w:t>num_pumps_DT_*</w:t>
+            </w:r>
+          </w:p>
+        </w:tc>
+        <w:tc>
+          <w:tcPr>
+            <w:tcW w:type="dxa" w:w="2551"/>
+            <w:shd w:fill="FFFFFF" w:val="clear"/>
+          </w:tcPr>
+          <w:p>
+            <w:r>
+              <w:rPr>
+                <w:sz w:val="18"/>
+              </w:rPr>
+              <w:t>— (4 колонки)</w:t>
+            </w:r>
+          </w:p>
+        </w:tc>
+        <w:tc>
+          <w:tcPr>
+            <w:tcW w:type="dxa" w:w="3118"/>
+            <w:shd w:fill="FFFFFF" w:val="clear"/>
+          </w:tcPr>
+          <w:p>
+            <w:r>
+              <w:rPr>
+                <w:sz w:val="18"/>
+              </w:rPr>
+              <w:t>static_reals</w:t>
+            </w:r>
+          </w:p>
+        </w:tc>
+      </w:tr>
+      <w:tr>
+        <w:tc>
+          <w:tcPr>
+            <w:tcW w:type="dxa" w:w="2551"/>
+            <w:shd w:fill="F2F2F2" w:val="clear"/>
+          </w:tcPr>
+          <w:p>
+            <w:r>
+              <w:rPr>
+                <w:sz w:val="18"/>
+              </w:rPr>
+              <w:t>has_* (5 к.)</w:t>
+            </w:r>
+          </w:p>
+        </w:tc>
+        <w:tc>
+          <w:tcPr>
+            <w:tcW w:type="dxa" w:w="2268"/>
+            <w:shd w:fill="F2F2F2" w:val="clear"/>
+          </w:tcPr>
+          <w:p>
+            <w:r>
+              <w:rPr>
+                <w:sz w:val="18"/>
+              </w:rPr>
+              <w:t>has_car_wash/cafe/...</w:t>
+            </w:r>
+          </w:p>
+        </w:tc>
+        <w:tc>
+          <w:tcPr>
+            <w:tcW w:type="dxa" w:w="2551"/>
+            <w:shd w:fill="F2F2F2" w:val="clear"/>
+          </w:tcPr>
+          <w:p>
+            <w:r>
+              <w:rPr>
+                <w:sz w:val="18"/>
+              </w:rPr>
+              <w:t>— (бинарные)</w:t>
+            </w:r>
+          </w:p>
+        </w:tc>
+        <w:tc>
+          <w:tcPr>
+            <w:tcW w:type="dxa" w:w="3118"/>
+            <w:shd w:fill="F2F2F2" w:val="clear"/>
+          </w:tcPr>
+          <w:p>
+            <w:r>
+              <w:rPr>
+                <w:sz w:val="18"/>
+              </w:rPr>
+              <w:t>static_reals</w:t>
+            </w:r>
+          </w:p>
+        </w:tc>
+      </w:tr>
+      <w:tr>
+        <w:tc>
+          <w:tcPr>
+            <w:tcW w:type="dxa" w:w="2551"/>
+            <w:shd w:fill="FFFFFF" w:val="clear"/>
+          </w:tcPr>
+          <w:p>
+            <w:r>
+              <w:rPr>
+                <w:sz w:val="18"/>
+              </w:rPr>
+              <w:t>competitors_within_5km</w:t>
+            </w:r>
+          </w:p>
+        </w:tc>
+        <w:tc>
+          <w:tcPr>
+            <w:tcW w:type="dxa" w:w="2268"/>
+            <w:shd w:fill="FFFFFF" w:val="clear"/>
+          </w:tcPr>
+          <w:p>
+            <w:r>
+              <w:rPr>
+                <w:sz w:val="18"/>
+              </w:rPr>
+              <w:t>competitors_within_5km</w:t>
+            </w:r>
+          </w:p>
+        </w:tc>
+        <w:tc>
+          <w:tcPr>
+            <w:tcW w:type="dxa" w:w="2551"/>
+            <w:shd w:fill="FFFFFF" w:val="clear"/>
+          </w:tcPr>
+          <w:p>
+            <w:r>
+              <w:rPr>
+                <w:sz w:val="18"/>
+              </w:rPr>
+              <w:t>—</w:t>
+            </w:r>
+          </w:p>
+        </w:tc>
+        <w:tc>
+          <w:tcPr>
+            <w:tcW w:type="dxa" w:w="3118"/>
+            <w:shd w:fill="FFFFFF" w:val="clear"/>
+          </w:tcPr>
+          <w:p>
+            <w:r>
+              <w:rPr>
+                <w:sz w:val="18"/>
+              </w:rPr>
+              <w:t>static_reals</w:t>
+            </w:r>
+          </w:p>
+        </w:tc>
+      </w:tr>
+      <w:tr>
+        <w:tc>
+          <w:tcPr>
+            <w:tcW w:type="dxa" w:w="2551"/>
+            <w:shd w:fill="F2F2F2" w:val="clear"/>
+          </w:tcPr>
+          <w:p>
+            <w:r>
+              <w:rPr>
+                <w:sz w:val="18"/>
+              </w:rPr>
+              <w:t>*_score (4 к.)</w:t>
+            </w:r>
+          </w:p>
+        </w:tc>
+        <w:tc>
+          <w:tcPr>
+            <w:tcW w:type="dxa" w:w="2268"/>
+            <w:shd w:fill="F2F2F2" w:val="clear"/>
+          </w:tcPr>
+          <w:p>
+            <w:r>
+              <w:rPr>
+                <w:sz w:val="18"/>
+              </w:rPr>
+              <w:t>customer/staff/corp/svc</w:t>
+            </w:r>
+          </w:p>
+        </w:tc>
+        <w:tc>
+          <w:tcPr>
+            <w:tcW w:type="dxa" w:w="2551"/>
+            <w:shd w:fill="F2F2F2" w:val="clear"/>
+          </w:tcPr>
+          <w:p>
+            <w:r>
+              <w:rPr>
+                <w:sz w:val="18"/>
+              </w:rPr>
+              <w:t>— (4 колонки)</w:t>
+            </w:r>
+          </w:p>
+        </w:tc>
+        <w:tc>
+          <w:tcPr>
+            <w:tcW w:type="dxa" w:w="3118"/>
+            <w:shd w:fill="F2F2F2" w:val="clear"/>
+          </w:tcPr>
+          <w:p>
+            <w:r>
+              <w:rPr>
+                <w:sz w:val="18"/>
+              </w:rPr>
+              <w:t>static_reals</w:t>
+            </w:r>
+          </w:p>
+        </w:tc>
+      </w:tr>
+      <w:tr>
+        <w:tc>
+          <w:tcPr>
+            <w:tcW w:type="dxa" w:w="2551"/>
+            <w:shd w:fill="FFFFFF" w:val="clear"/>
+          </w:tcPr>
+          <w:p>
+            <w:r>
+              <w:rPr>
+                <w:sz w:val="18"/>
+              </w:rPr>
+              <w:t>base_price_* (7 к.)</w:t>
+            </w:r>
+          </w:p>
+        </w:tc>
+        <w:tc>
+          <w:tcPr>
+            <w:tcW w:type="dxa" w:w="2268"/>
+            <w:shd w:fill="FFFFFF" w:val="clear"/>
+          </w:tcPr>
+          <w:p>
+            <w:r>
+              <w:rPr>
+                <w:sz w:val="18"/>
+              </w:rPr>
+              <w:t>base_price_AI92/...</w:t>
+            </w:r>
+          </w:p>
+        </w:tc>
+        <w:tc>
+          <w:tcPr>
+            <w:tcW w:type="dxa" w:w="2551"/>
+            <w:shd w:fill="FFFFFF" w:val="clear"/>
+          </w:tcPr>
+          <w:p>
+            <w:r>
+              <w:rPr>
+                <w:sz w:val="18"/>
+              </w:rPr>
+              <w:t>— (7 колонок)</w:t>
+            </w:r>
+          </w:p>
+        </w:tc>
+        <w:tc>
+          <w:tcPr>
+            <w:tcW w:type="dxa" w:w="3118"/>
+            <w:shd w:fill="FFFFFF" w:val="clear"/>
+          </w:tcPr>
+          <w:p>
+            <w:r>
+              <w:rPr>
+                <w:sz w:val="18"/>
+              </w:rPr>
+              <w:t>static_reals</w:t>
+            </w:r>
+          </w:p>
+        </w:tc>
+      </w:tr>
+      <w:tr>
+        <w:tc>
+          <w:tcPr>
+            <w:tcW w:type="dxa" w:w="2551"/>
+            <w:shd w:fill="F2F2F2" w:val="clear"/>
+          </w:tcPr>
+          <w:p>
+            <w:r>
+              <w:rPr>
+                <w:sz w:val="18"/>
+              </w:rPr>
+              <w:t>season_enc</w:t>
+            </w:r>
+          </w:p>
+        </w:tc>
+        <w:tc>
+          <w:tcPr>
+            <w:tcW w:type="dxa" w:w="2268"/>
+            <w:shd w:fill="F2F2F2" w:val="clear"/>
+          </w:tcPr>
+          <w:p>
+            <w:r>
+              <w:rPr>
+                <w:sz w:val="18"/>
+              </w:rPr>
+              <w:t>season</w:t>
+            </w:r>
+          </w:p>
+        </w:tc>
+        <w:tc>
+          <w:tcPr>
+            <w:tcW w:type="dxa" w:w="2551"/>
+            <w:shd w:fill="F2F2F2" w:val="clear"/>
+          </w:tcPr>
+          <w:p>
+            <w:r>
+              <w:rPr>
+                <w:sz w:val="18"/>
+              </w:rPr>
+              <w:t>LabelEncoder</w:t>
+            </w:r>
+          </w:p>
+        </w:tc>
+        <w:tc>
+          <w:tcPr>
+            <w:tcW w:type="dxa" w:w="3118"/>
+            <w:shd w:fill="F2F2F2" w:val="clear"/>
+          </w:tcPr>
+          <w:p>
+            <w:r>
+              <w:rPr>
+                <w:sz w:val="18"/>
+              </w:rPr>
+              <w:t>known_categoricals</w:t>
+            </w:r>
+          </w:p>
+        </w:tc>
+      </w:tr>
+      <w:tr>
+        <w:tc>
+          <w:tcPr>
+            <w:tcW w:type="dxa" w:w="2551"/>
+            <w:shd w:fill="FFFFFF" w:val="clear"/>
+          </w:tcPr>
+          <w:p>
+            <w:r>
+              <w:rPr>
+                <w:sz w:val="18"/>
+              </w:rPr>
+              <w:t>day_name_enc</w:t>
+            </w:r>
+          </w:p>
+        </w:tc>
+        <w:tc>
+          <w:tcPr>
+            <w:tcW w:type="dxa" w:w="2268"/>
+            <w:shd w:fill="FFFFFF" w:val="clear"/>
+          </w:tcPr>
+          <w:p>
+            <w:r>
+              <w:rPr>
+                <w:sz w:val="18"/>
+              </w:rPr>
+              <w:t>day_name</w:t>
+            </w:r>
+          </w:p>
+        </w:tc>
+        <w:tc>
+          <w:tcPr>
+            <w:tcW w:type="dxa" w:w="2551"/>
+            <w:shd w:fill="FFFFFF" w:val="clear"/>
+          </w:tcPr>
+          <w:p>
+            <w:r>
+              <w:rPr>
+                <w:sz w:val="18"/>
+              </w:rPr>
+              <w:t>LabelEncoder</w:t>
+            </w:r>
+          </w:p>
+        </w:tc>
+        <w:tc>
+          <w:tcPr>
+            <w:tcW w:type="dxa" w:w="3118"/>
+            <w:shd w:fill="FFFFFF" w:val="clear"/>
+          </w:tcPr>
+          <w:p>
+            <w:r>
+              <w:rPr>
+                <w:sz w:val="18"/>
+              </w:rPr>
+              <w:t>known_categoricals</w:t>
+            </w:r>
+          </w:p>
+        </w:tc>
+      </w:tr>
+      <w:tr>
+        <w:tc>
+          <w:tcPr>
+            <w:tcW w:type="dxa" w:w="2551"/>
+            <w:shd w:fill="F2F2F2" w:val="clear"/>
+          </w:tcPr>
+          <w:p>
+            <w:r>
+              <w:rPr>
+                <w:sz w:val="18"/>
+              </w:rPr>
+              <w:t>ad_channel_enc</w:t>
+            </w:r>
+          </w:p>
+        </w:tc>
+        <w:tc>
+          <w:tcPr>
+            <w:tcW w:type="dxa" w:w="2268"/>
+            <w:shd w:fill="F2F2F2" w:val="clear"/>
+          </w:tcPr>
+          <w:p>
+            <w:r>
+              <w:rPr>
+                <w:sz w:val="18"/>
+              </w:rPr>
+              <w:t>ad_channel</w:t>
+            </w:r>
+          </w:p>
+        </w:tc>
+        <w:tc>
+          <w:tcPr>
+            <w:tcW w:type="dxa" w:w="2551"/>
+            <w:shd w:fill="F2F2F2" w:val="clear"/>
+          </w:tcPr>
+          <w:p>
+            <w:r>
+              <w:rPr>
+                <w:sz w:val="18"/>
+              </w:rPr>
+              <w:t>NaN→'нет_рекламы' + LabelEncoder</w:t>
+            </w:r>
+          </w:p>
+        </w:tc>
+        <w:tc>
+          <w:tcPr>
+            <w:tcW w:type="dxa" w:w="3118"/>
+            <w:shd w:fill="F2F2F2" w:val="clear"/>
+          </w:tcPr>
+          <w:p>
+            <w:r>
+              <w:rPr>
+                <w:sz w:val="18"/>
+              </w:rPr>
+              <w:t>known_categoricals</w:t>
+            </w:r>
+          </w:p>
+        </w:tc>
+      </w:tr>
+      <w:tr>
+        <w:tc>
+          <w:tcPr>
+            <w:tcW w:type="dxa" w:w="2551"/>
+            <w:shd w:fill="FFFFFF" w:val="clear"/>
+          </w:tcPr>
+          <w:p>
+            <w:r>
+              <w:rPr>
+                <w:sz w:val="18"/>
+              </w:rPr>
+              <w:t>holiday_name_enc</w:t>
+            </w:r>
+          </w:p>
+        </w:tc>
+        <w:tc>
+          <w:tcPr>
+            <w:tcW w:type="dxa" w:w="2268"/>
+            <w:shd w:fill="FFFFFF" w:val="clear"/>
+          </w:tcPr>
+          <w:p>
+            <w:r>
+              <w:rPr>
+                <w:sz w:val="18"/>
+              </w:rPr>
+              <w:t>holiday_name</w:t>
+            </w:r>
+          </w:p>
+        </w:tc>
+        <w:tc>
+          <w:tcPr>
+            <w:tcW w:type="dxa" w:w="2551"/>
+            <w:shd w:fill="FFFFFF" w:val="clear"/>
+          </w:tcPr>
+          <w:p>
+            <w:r>
+              <w:rPr>
+                <w:sz w:val="18"/>
+              </w:rPr>
+              <w:t>NaN→'нет_праздника' + LabelEncoder</w:t>
+            </w:r>
+          </w:p>
+        </w:tc>
+        <w:tc>
+          <w:tcPr>
+            <w:tcW w:type="dxa" w:w="3118"/>
+            <w:shd w:fill="FFFFFF" w:val="clear"/>
+          </w:tcPr>
+          <w:p>
+            <w:r>
+              <w:rPr>
+                <w:sz w:val="18"/>
+              </w:rPr>
+              <w:t>known_categoricals</w:t>
+            </w:r>
+          </w:p>
+        </w:tc>
+      </w:tr>
+      <w:tr>
+        <w:tc>
+          <w:tcPr>
+            <w:tcW w:type="dxa" w:w="2551"/>
+            <w:shd w:fill="F2F2F2" w:val="clear"/>
+          </w:tcPr>
+          <w:p>
+            <w:r>
+              <w:rPr>
+                <w:sz w:val="18"/>
+              </w:rPr>
+              <w:t>hour</w:t>
+            </w:r>
+          </w:p>
+        </w:tc>
+        <w:tc>
+          <w:tcPr>
+            <w:tcW w:type="dxa" w:w="2268"/>
+            <w:shd w:fill="F2F2F2" w:val="clear"/>
+          </w:tcPr>
+          <w:p>
+            <w:r>
+              <w:rPr>
+                <w:sz w:val="18"/>
+              </w:rPr>
+              <w:t>hour</w:t>
+            </w:r>
+          </w:p>
+        </w:tc>
+        <w:tc>
+          <w:tcPr>
+            <w:tcW w:type="dxa" w:w="2551"/>
+            <w:shd w:fill="F2F2F2" w:val="clear"/>
+          </w:tcPr>
+          <w:p>
+            <w:r>
+              <w:rPr>
+                <w:sz w:val="18"/>
+              </w:rPr>
+              <w:t>Z-score</w:t>
+            </w:r>
+          </w:p>
+        </w:tc>
+        <w:tc>
+          <w:tcPr>
+            <w:tcW w:type="dxa" w:w="3118"/>
+            <w:shd w:fill="F2F2F2" w:val="clear"/>
+          </w:tcPr>
+          <w:p>
+            <w:r>
+              <w:rPr>
+                <w:sz w:val="18"/>
+              </w:rPr>
+              <w:t>known_reals</w:t>
+            </w:r>
+          </w:p>
+        </w:tc>
+      </w:tr>
+      <w:tr>
+        <w:tc>
+          <w:tcPr>
+            <w:tcW w:type="dxa" w:w="2551"/>
+            <w:shd w:fill="FFFFFF" w:val="clear"/>
+          </w:tcPr>
+          <w:p>
+            <w:r>
+              <w:rPr>
+                <w:sz w:val="18"/>
+              </w:rPr>
+              <w:t>hour_sin / hour_cos</w:t>
+            </w:r>
+          </w:p>
+        </w:tc>
+        <w:tc>
+          <w:tcPr>
+            <w:tcW w:type="dxa" w:w="2268"/>
+            <w:shd w:fill="FFFFFF" w:val="clear"/>
+          </w:tcPr>
+          <w:p>
+            <w:r>
+              <w:rPr>
+                <w:sz w:val="18"/>
+              </w:rPr>
+              <w:t>hour</w:t>
+            </w:r>
+          </w:p>
+        </w:tc>
+        <w:tc>
+          <w:tcPr>
+            <w:tcW w:type="dxa" w:w="2551"/>
+            <w:shd w:fill="FFFFFF" w:val="clear"/>
+          </w:tcPr>
+          <w:p>
+            <w:r>
+              <w:rPr>
+                <w:sz w:val="18"/>
+              </w:rPr>
+              <w:t>sin/cos(2π·h/24)</w:t>
+            </w:r>
+          </w:p>
+        </w:tc>
+        <w:tc>
+          <w:tcPr>
+            <w:tcW w:type="dxa" w:w="3118"/>
+            <w:shd w:fill="FFFFFF" w:val="clear"/>
+          </w:tcPr>
+          <w:p>
+            <w:r>
+              <w:rPr>
+                <w:sz w:val="18"/>
+              </w:rPr>
+              <w:t>known_reals</w:t>
+            </w:r>
+          </w:p>
+        </w:tc>
+      </w:tr>
+      <w:tr>
+        <w:tc>
+          <w:tcPr>
+            <w:tcW w:type="dxa" w:w="2551"/>
+            <w:shd w:fill="F2F2F2" w:val="clear"/>
+          </w:tcPr>
+          <w:p>
+            <w:r>
+              <w:rPr>
+                <w:sz w:val="18"/>
+              </w:rPr>
+              <w:t>day_of_week</w:t>
+            </w:r>
+          </w:p>
+        </w:tc>
+        <w:tc>
+          <w:tcPr>
+            <w:tcW w:type="dxa" w:w="2268"/>
+            <w:shd w:fill="F2F2F2" w:val="clear"/>
+          </w:tcPr>
+          <w:p>
+            <w:r>
+              <w:rPr>
+                <w:sz w:val="18"/>
+              </w:rPr>
+              <w:t>day_of_week</w:t>
+            </w:r>
+          </w:p>
+        </w:tc>
+        <w:tc>
+          <w:tcPr>
+            <w:tcW w:type="dxa" w:w="2551"/>
+            <w:shd w:fill="F2F2F2" w:val="clear"/>
+          </w:tcPr>
+          <w:p>
+            <w:r>
+              <w:rPr>
+                <w:sz w:val="18"/>
+              </w:rPr>
+              <w:t>Z-score</w:t>
+            </w:r>
+          </w:p>
+        </w:tc>
+        <w:tc>
+          <w:tcPr>
+            <w:tcW w:type="dxa" w:w="3118"/>
+            <w:shd w:fill="F2F2F2" w:val="clear"/>
+          </w:tcPr>
+          <w:p>
+            <w:r>
+              <w:rPr>
+                <w:sz w:val="18"/>
+              </w:rPr>
+              <w:t>known_reals</w:t>
+            </w:r>
+          </w:p>
+        </w:tc>
+      </w:tr>
+      <w:tr>
+        <w:tc>
+          <w:tcPr>
+            <w:tcW w:type="dxa" w:w="2551"/>
+            <w:shd w:fill="FFFFFF" w:val="clear"/>
+          </w:tcPr>
+          <w:p>
+            <w:r>
+              <w:rPr>
+                <w:sz w:val="18"/>
+              </w:rPr>
+              <w:t>dow_sin / dow_cos</w:t>
+            </w:r>
+          </w:p>
+        </w:tc>
+        <w:tc>
+          <w:tcPr>
+            <w:tcW w:type="dxa" w:w="2268"/>
+            <w:shd w:fill="FFFFFF" w:val="clear"/>
+          </w:tcPr>
+          <w:p>
+            <w:r>
+              <w:rPr>
+                <w:sz w:val="18"/>
+              </w:rPr>
+              <w:t>day_of_week</w:t>
+            </w:r>
+          </w:p>
+        </w:tc>
+        <w:tc>
+          <w:tcPr>
+            <w:tcW w:type="dxa" w:w="2551"/>
+            <w:shd w:fill="FFFFFF" w:val="clear"/>
+          </w:tcPr>
+          <w:p>
+            <w:r>
+              <w:rPr>
+                <w:sz w:val="18"/>
+              </w:rPr>
+              <w:t>sin/cos(2π·d/7)</w:t>
+            </w:r>
+          </w:p>
+        </w:tc>
+        <w:tc>
+          <w:tcPr>
+            <w:tcW w:type="dxa" w:w="3118"/>
+            <w:shd w:fill="FFFFFF" w:val="clear"/>
+          </w:tcPr>
+          <w:p>
+            <w:r>
+              <w:rPr>
+                <w:sz w:val="18"/>
+              </w:rPr>
+              <w:t>known_reals</w:t>
+            </w:r>
+          </w:p>
+        </w:tc>
+      </w:tr>
+      <w:tr>
+        <w:tc>
+          <w:tcPr>
+            <w:tcW w:type="dxa" w:w="2551"/>
+            <w:shd w:fill="F2F2F2" w:val="clear"/>
+          </w:tcPr>
+          <w:p>
+            <w:r>
+              <w:rPr>
+                <w:sz w:val="18"/>
+              </w:rPr>
+              <w:t>month</w:t>
+            </w:r>
+          </w:p>
+        </w:tc>
+        <w:tc>
+          <w:tcPr>
+            <w:tcW w:type="dxa" w:w="2268"/>
+            <w:shd w:fill="F2F2F2" w:val="clear"/>
+          </w:tcPr>
+          <w:p>
+            <w:r>
+              <w:rPr>
+                <w:sz w:val="18"/>
+              </w:rPr>
+              <w:t>month</w:t>
+            </w:r>
+          </w:p>
+        </w:tc>
+        <w:tc>
+          <w:tcPr>
+            <w:tcW w:type="dxa" w:w="2551"/>
+            <w:shd w:fill="F2F2F2" w:val="clear"/>
+          </w:tcPr>
+          <w:p>
+            <w:r>
+              <w:rPr>
+                <w:sz w:val="18"/>
+              </w:rPr>
+              <w:t>Z-score</w:t>
+            </w:r>
+          </w:p>
+        </w:tc>
+        <w:tc>
+          <w:tcPr>
+            <w:tcW w:type="dxa" w:w="3118"/>
+            <w:shd w:fill="F2F2F2" w:val="clear"/>
+          </w:tcPr>
+          <w:p>
+            <w:r>
+              <w:rPr>
+                <w:sz w:val="18"/>
+              </w:rPr>
+              <w:t>known_reals</w:t>
+            </w:r>
+          </w:p>
+        </w:tc>
+      </w:tr>
+      <w:tr>
+        <w:tc>
+          <w:tcPr>
+            <w:tcW w:type="dxa" w:w="2551"/>
+            <w:shd w:fill="FFFFFF" w:val="clear"/>
+          </w:tcPr>
+          <w:p>
+            <w:r>
+              <w:rPr>
+                <w:sz w:val="18"/>
+              </w:rPr>
+              <w:t>month_sin / month_cos</w:t>
+            </w:r>
+          </w:p>
+        </w:tc>
+        <w:tc>
+          <w:tcPr>
+            <w:tcW w:type="dxa" w:w="2268"/>
+            <w:shd w:fill="FFFFFF" w:val="clear"/>
+          </w:tcPr>
+          <w:p>
+            <w:r>
+              <w:rPr>
+                <w:sz w:val="18"/>
+              </w:rPr>
+              <w:t>month</w:t>
+            </w:r>
+          </w:p>
+        </w:tc>
+        <w:tc>
+          <w:tcPr>
+            <w:tcW w:type="dxa" w:w="2551"/>
+            <w:shd w:fill="FFFFFF" w:val="clear"/>
+          </w:tcPr>
+          <w:p>
+            <w:r>
+              <w:rPr>
+                <w:sz w:val="18"/>
+              </w:rPr>
+              <w:t>sin/cos(2π·m/12)</w:t>
+            </w:r>
+          </w:p>
+        </w:tc>
+        <w:tc>
+          <w:tcPr>
+            <w:tcW w:type="dxa" w:w="3118"/>
+            <w:shd w:fill="FFFFFF" w:val="clear"/>
+          </w:tcPr>
+          <w:p>
+            <w:r>
+              <w:rPr>
+                <w:sz w:val="18"/>
+              </w:rPr>
+              <w:t>known_reals</w:t>
+            </w:r>
+          </w:p>
+        </w:tc>
+      </w:tr>
+      <w:tr>
+        <w:tc>
+          <w:tcPr>
+            <w:tcW w:type="dxa" w:w="2551"/>
+            <w:shd w:fill="F2F2F2" w:val="clear"/>
+          </w:tcPr>
+          <w:p>
+            <w:r>
+              <w:rPr>
+                <w:sz w:val="18"/>
+              </w:rPr>
+              <w:t>week_of_year</w:t>
+            </w:r>
+          </w:p>
+        </w:tc>
+        <w:tc>
+          <w:tcPr>
+            <w:tcW w:type="dxa" w:w="2268"/>
+            <w:shd w:fill="F2F2F2" w:val="clear"/>
+          </w:tcPr>
+          <w:p>
+            <w:r>
+              <w:rPr>
+                <w:sz w:val="18"/>
+              </w:rPr>
+              <w:t>week_of_year</w:t>
+            </w:r>
+          </w:p>
+        </w:tc>
+        <w:tc>
+          <w:tcPr>
+            <w:tcW w:type="dxa" w:w="2551"/>
+            <w:shd w:fill="F2F2F2" w:val="clear"/>
+          </w:tcPr>
+          <w:p>
+            <w:r>
+              <w:rPr>
+                <w:sz w:val="18"/>
+              </w:rPr>
+              <w:t>Z-score</w:t>
+            </w:r>
+          </w:p>
+        </w:tc>
+        <w:tc>
+          <w:tcPr>
+            <w:tcW w:type="dxa" w:w="3118"/>
+            <w:shd w:fill="F2F2F2" w:val="clear"/>
+          </w:tcPr>
+          <w:p>
+            <w:r>
+              <w:rPr>
+                <w:sz w:val="18"/>
+              </w:rPr>
+              <w:t>known_reals</w:t>
+            </w:r>
+          </w:p>
+        </w:tc>
+      </w:tr>
+      <w:tr>
+        <w:tc>
+          <w:tcPr>
+            <w:tcW w:type="dxa" w:w="2551"/>
+            <w:shd w:fill="FFFFFF" w:val="clear"/>
+          </w:tcPr>
+          <w:p>
+            <w:r>
+              <w:rPr>
+                <w:sz w:val="18"/>
+              </w:rPr>
+              <w:t>woy_sin / woy_cos</w:t>
+            </w:r>
+          </w:p>
+        </w:tc>
+        <w:tc>
+          <w:tcPr>
+            <w:tcW w:type="dxa" w:w="2268"/>
+            <w:shd w:fill="FFFFFF" w:val="clear"/>
+          </w:tcPr>
+          <w:p>
+            <w:r>
+              <w:rPr>
+                <w:sz w:val="18"/>
+              </w:rPr>
+              <w:t>week_of_year</w:t>
+            </w:r>
+          </w:p>
+        </w:tc>
+        <w:tc>
+          <w:tcPr>
+            <w:tcW w:type="dxa" w:w="2551"/>
+            <w:shd w:fill="FFFFFF" w:val="clear"/>
+          </w:tcPr>
+          <w:p>
+            <w:r>
+              <w:rPr>
+                <w:sz w:val="18"/>
+              </w:rPr>
+              <w:t>sin/cos(2π·w/52)</w:t>
+            </w:r>
+          </w:p>
+        </w:tc>
+        <w:tc>
+          <w:tcPr>
+            <w:tcW w:type="dxa" w:w="3118"/>
+            <w:shd w:fill="FFFFFF" w:val="clear"/>
+          </w:tcPr>
+          <w:p>
+            <w:r>
+              <w:rPr>
+                <w:sz w:val="18"/>
+              </w:rPr>
+              <w:t>known_reals</w:t>
+            </w:r>
+          </w:p>
+        </w:tc>
+      </w:tr>
+      <w:tr>
+        <w:tc>
+          <w:tcPr>
+            <w:tcW w:type="dxa" w:w="2551"/>
+            <w:shd w:fill="F2F2F2" w:val="clear"/>
+          </w:tcPr>
+          <w:p>
+            <w:r>
+              <w:rPr>
+                <w:sz w:val="18"/>
+              </w:rPr>
+              <w:t>quarter</w:t>
+            </w:r>
+          </w:p>
+        </w:tc>
+        <w:tc>
+          <w:tcPr>
+            <w:tcW w:type="dxa" w:w="2268"/>
+            <w:shd w:fill="F2F2F2" w:val="clear"/>
+          </w:tcPr>
+          <w:p>
+            <w:r>
+              <w:rPr>
+                <w:sz w:val="18"/>
+              </w:rPr>
+              <w:t>quarter</w:t>
+            </w:r>
+          </w:p>
+        </w:tc>
+        <w:tc>
+          <w:tcPr>
+            <w:tcW w:type="dxa" w:w="2551"/>
+            <w:shd w:fill="F2F2F2" w:val="clear"/>
+          </w:tcPr>
+          <w:p>
+            <w:r>
+              <w:rPr>
+                <w:sz w:val="18"/>
+              </w:rPr>
+              <w:t>Z-score</w:t>
+            </w:r>
+          </w:p>
+        </w:tc>
+        <w:tc>
+          <w:tcPr>
+            <w:tcW w:type="dxa" w:w="3118"/>
+            <w:shd w:fill="F2F2F2" w:val="clear"/>
+          </w:tcPr>
+          <w:p>
+            <w:r>
+              <w:rPr>
+                <w:sz w:val="18"/>
+              </w:rPr>
+              <w:t>known_reals</w:t>
+            </w:r>
+          </w:p>
+        </w:tc>
+      </w:tr>
+      <w:tr>
+        <w:tc>
+          <w:tcPr>
+            <w:tcW w:type="dxa" w:w="2551"/>
+            <w:shd w:fill="FFFFFF" w:val="clear"/>
+          </w:tcPr>
+          <w:p>
+            <w:r>
+              <w:rPr>
+                <w:sz w:val="18"/>
+              </w:rPr>
+              <w:t>is_weekend</w:t>
+            </w:r>
+          </w:p>
+        </w:tc>
+        <w:tc>
+          <w:tcPr>
+            <w:tcW w:type="dxa" w:w="2268"/>
+            <w:shd w:fill="FFFFFF" w:val="clear"/>
+          </w:tcPr>
+          <w:p>
+            <w:r>
+              <w:rPr>
+                <w:sz w:val="18"/>
+              </w:rPr>
+              <w:t>is_weekend</w:t>
+            </w:r>
+          </w:p>
+        </w:tc>
+        <w:tc>
+          <w:tcPr>
+            <w:tcW w:type="dxa" w:w="2551"/>
+            <w:shd w:fill="FFFFFF" w:val="clear"/>
+          </w:tcPr>
+          <w:p>
+            <w:r>
+              <w:rPr>
+                <w:sz w:val="18"/>
+              </w:rPr>
+              <w:t>— (бинарная)</w:t>
+            </w:r>
+          </w:p>
+        </w:tc>
+        <w:tc>
+          <w:tcPr>
+            <w:tcW w:type="dxa" w:w="3118"/>
+            <w:shd w:fill="FFFFFF" w:val="clear"/>
+          </w:tcPr>
+          <w:p>
+            <w:r>
+              <w:rPr>
+                <w:sz w:val="18"/>
+              </w:rPr>
+              <w:t>known_reals</w:t>
+            </w:r>
+          </w:p>
+        </w:tc>
+      </w:tr>
+      <w:tr>
+        <w:tc>
+          <w:tcPr>
+            <w:tcW w:type="dxa" w:w="2551"/>
+            <w:shd w:fill="F2F2F2" w:val="clear"/>
+          </w:tcPr>
+          <w:p>
+            <w:r>
+              <w:rPr>
+                <w:sz w:val="18"/>
+              </w:rPr>
+              <w:t>is_holiday</w:t>
+            </w:r>
+          </w:p>
+        </w:tc>
+        <w:tc>
+          <w:tcPr>
+            <w:tcW w:type="dxa" w:w="2268"/>
+            <w:shd w:fill="F2F2F2" w:val="clear"/>
+          </w:tcPr>
+          <w:p>
+            <w:r>
+              <w:rPr>
+                <w:sz w:val="18"/>
+              </w:rPr>
+              <w:t>is_holiday</w:t>
+            </w:r>
+          </w:p>
+        </w:tc>
+        <w:tc>
+          <w:tcPr>
+            <w:tcW w:type="dxa" w:w="2551"/>
+            <w:shd w:fill="F2F2F2" w:val="clear"/>
+          </w:tcPr>
+          <w:p>
+            <w:r>
+              <w:rPr>
+                <w:sz w:val="18"/>
+              </w:rPr>
+              <w:t>— (бинарная)</w:t>
+            </w:r>
+          </w:p>
+        </w:tc>
+        <w:tc>
+          <w:tcPr>
+            <w:tcW w:type="dxa" w:w="3118"/>
+            <w:shd w:fill="F2F2F2" w:val="clear"/>
+          </w:tcPr>
+          <w:p>
+            <w:r>
+              <w:rPr>
+                <w:sz w:val="18"/>
+              </w:rPr>
+              <w:t>known_reals</w:t>
+            </w:r>
+          </w:p>
+        </w:tc>
+      </w:tr>
+      <w:tr>
+        <w:tc>
+          <w:tcPr>
+            <w:tcW w:type="dxa" w:w="2551"/>
+            <w:shd w:fill="FFFFFF" w:val="clear"/>
+          </w:tcPr>
+          <w:p>
+            <w:r>
+              <w:rPr>
+                <w:sz w:val="18"/>
+              </w:rPr>
+              <w:t>is_rush_hour</w:t>
+            </w:r>
+          </w:p>
+        </w:tc>
+        <w:tc>
+          <w:tcPr>
+            <w:tcW w:type="dxa" w:w="2268"/>
+            <w:shd w:fill="FFFFFF" w:val="clear"/>
+          </w:tcPr>
+          <w:p>
+            <w:r>
+              <w:rPr>
+                <w:sz w:val="18"/>
+              </w:rPr>
+              <w:t>is_rush_hour</w:t>
+            </w:r>
+          </w:p>
+        </w:tc>
+        <w:tc>
+          <w:tcPr>
+            <w:tcW w:type="dxa" w:w="2551"/>
+            <w:shd w:fill="FFFFFF" w:val="clear"/>
+          </w:tcPr>
+          <w:p>
+            <w:r>
+              <w:rPr>
+                <w:sz w:val="18"/>
+              </w:rPr>
+              <w:t>— (бинарная)</w:t>
+            </w:r>
+          </w:p>
+        </w:tc>
+        <w:tc>
+          <w:tcPr>
+            <w:tcW w:type="dxa" w:w="3118"/>
+            <w:shd w:fill="FFFFFF" w:val="clear"/>
+          </w:tcPr>
+          <w:p>
+            <w:r>
+              <w:rPr>
+                <w:sz w:val="18"/>
+              </w:rPr>
+              <w:t>known_reals</w:t>
+            </w:r>
+          </w:p>
+        </w:tc>
+      </w:tr>
+      <w:tr>
+        <w:tc>
+          <w:tcPr>
+            <w:tcW w:type="dxa" w:w="2551"/>
+            <w:shd w:fill="F2F2F2" w:val="clear"/>
+          </w:tcPr>
+          <w:p>
+            <w:r>
+              <w:rPr>
+                <w:sz w:val="18"/>
+              </w:rPr>
+              <w:t>is_night</w:t>
+            </w:r>
+          </w:p>
+        </w:tc>
+        <w:tc>
+          <w:tcPr>
+            <w:tcW w:type="dxa" w:w="2268"/>
+            <w:shd w:fill="F2F2F2" w:val="clear"/>
+          </w:tcPr>
+          <w:p>
+            <w:r>
+              <w:rPr>
+                <w:sz w:val="18"/>
+              </w:rPr>
+              <w:t>is_night</w:t>
+            </w:r>
+          </w:p>
+        </w:tc>
+        <w:tc>
+          <w:tcPr>
+            <w:tcW w:type="dxa" w:w="2551"/>
+            <w:shd w:fill="F2F2F2" w:val="clear"/>
+          </w:tcPr>
+          <w:p>
+            <w:r>
+              <w:rPr>
+                <w:sz w:val="18"/>
+              </w:rPr>
+              <w:t>— (бинарная)</w:t>
+            </w:r>
+          </w:p>
+        </w:tc>
+        <w:tc>
+          <w:tcPr>
+            <w:tcW w:type="dxa" w:w="3118"/>
+            <w:shd w:fill="F2F2F2" w:val="clear"/>
+          </w:tcPr>
+          <w:p>
+            <w:r>
+              <w:rPr>
+                <w:sz w:val="18"/>
+              </w:rPr>
+              <w:t>known_reals</w:t>
+            </w:r>
+          </w:p>
+        </w:tc>
+      </w:tr>
+      <w:tr>
+        <w:tc>
+          <w:tcPr>
+            <w:tcW w:type="dxa" w:w="2551"/>
+            <w:shd w:fill="FFFFFF" w:val="clear"/>
+          </w:tcPr>
+          <w:p>
+            <w:r>
+              <w:rPr>
+                <w:sz w:val="18"/>
+              </w:rPr>
+              <w:t>promotion_fuel_active</w:t>
+            </w:r>
+          </w:p>
+        </w:tc>
+        <w:tc>
+          <w:tcPr>
+            <w:tcW w:type="dxa" w:w="2268"/>
+            <w:shd w:fill="FFFFFF" w:val="clear"/>
+          </w:tcPr>
+          <w:p>
+            <w:r>
+              <w:rPr>
+                <w:sz w:val="18"/>
+              </w:rPr>
+              <w:t>promotion_fuel_active</w:t>
+            </w:r>
+          </w:p>
+        </w:tc>
+        <w:tc>
+          <w:tcPr>
+            <w:tcW w:type="dxa" w:w="2551"/>
+            <w:shd w:fill="FFFFFF" w:val="clear"/>
+          </w:tcPr>
+          <w:p>
+            <w:r>
+              <w:rPr>
+                <w:sz w:val="18"/>
+              </w:rPr>
+              <w:t>— (бинарная)</w:t>
+            </w:r>
+          </w:p>
+        </w:tc>
+        <w:tc>
+          <w:tcPr>
+            <w:tcW w:type="dxa" w:w="3118"/>
+            <w:shd w:fill="FFFFFF" w:val="clear"/>
+          </w:tcPr>
+          <w:p>
+            <w:r>
+              <w:rPr>
+                <w:sz w:val="18"/>
+              </w:rPr>
+              <w:t>known_reals</w:t>
+            </w:r>
+          </w:p>
+        </w:tc>
+      </w:tr>
+      <w:tr>
+        <w:tc>
+          <w:tcPr>
+            <w:tcW w:type="dxa" w:w="2551"/>
+            <w:shd w:fill="F2F2F2" w:val="clear"/>
+          </w:tcPr>
+          <w:p>
+            <w:r>
+              <w:rPr>
+                <w:sz w:val="18"/>
+              </w:rPr>
+              <w:t>promotion_shop_active</w:t>
+            </w:r>
+          </w:p>
+        </w:tc>
+        <w:tc>
+          <w:tcPr>
+            <w:tcW w:type="dxa" w:w="2268"/>
+            <w:shd w:fill="F2F2F2" w:val="clear"/>
+          </w:tcPr>
+          <w:p>
+            <w:r>
+              <w:rPr>
+                <w:sz w:val="18"/>
+              </w:rPr>
+              <w:t>promotion_shop_active</w:t>
+            </w:r>
+          </w:p>
+        </w:tc>
+        <w:tc>
+          <w:tcPr>
+            <w:tcW w:type="dxa" w:w="2551"/>
+            <w:shd w:fill="F2F2F2" w:val="clear"/>
+          </w:tcPr>
+          <w:p>
+            <w:r>
+              <w:rPr>
+                <w:sz w:val="18"/>
+              </w:rPr>
+              <w:t>— (бинарная)</w:t>
+            </w:r>
+          </w:p>
+        </w:tc>
+        <w:tc>
+          <w:tcPr>
+            <w:tcW w:type="dxa" w:w="3118"/>
+            <w:shd w:fill="F2F2F2" w:val="clear"/>
+          </w:tcPr>
+          <w:p>
+            <w:r>
+              <w:rPr>
+                <w:sz w:val="18"/>
+              </w:rPr>
+              <w:t>known_reals</w:t>
+            </w:r>
+          </w:p>
+        </w:tc>
+      </w:tr>
+      <w:tr>
+        <w:tc>
+          <w:tcPr>
+            <w:tcW w:type="dxa" w:w="2551"/>
+            <w:shd w:fill="FFFFFF" w:val="clear"/>
+          </w:tcPr>
+          <w:p>
+            <w:r>
+              <w:rPr>
+                <w:sz w:val="18"/>
+              </w:rPr>
+              <w:t>promotion_cafe_active</w:t>
+            </w:r>
+          </w:p>
+        </w:tc>
+        <w:tc>
+          <w:tcPr>
+            <w:tcW w:type="dxa" w:w="2268"/>
+            <w:shd w:fill="FFFFFF" w:val="clear"/>
+          </w:tcPr>
+          <w:p>
+            <w:r>
+              <w:rPr>
+                <w:sz w:val="18"/>
+              </w:rPr>
+              <w:t>promotion_cafe_active</w:t>
+            </w:r>
+          </w:p>
+        </w:tc>
+        <w:tc>
+          <w:tcPr>
+            <w:tcW w:type="dxa" w:w="2551"/>
+            <w:shd w:fill="FFFFFF" w:val="clear"/>
+          </w:tcPr>
+          <w:p>
+            <w:r>
+              <w:rPr>
+                <w:sz w:val="18"/>
+              </w:rPr>
+              <w:t>— (бинарная)</w:t>
+            </w:r>
+          </w:p>
+        </w:tc>
+        <w:tc>
+          <w:tcPr>
+            <w:tcW w:type="dxa" w:w="3118"/>
+            <w:shd w:fill="FFFFFF" w:val="clear"/>
+          </w:tcPr>
+          <w:p>
+            <w:r>
+              <w:rPr>
+                <w:sz w:val="18"/>
+              </w:rPr>
+              <w:t>known_reals</w:t>
+            </w:r>
+          </w:p>
+        </w:tc>
+      </w:tr>
+      <w:tr>
+        <w:tc>
+          <w:tcPr>
+            <w:tcW w:type="dxa" w:w="2551"/>
+            <w:shd w:fill="F2F2F2" w:val="clear"/>
+          </w:tcPr>
+          <w:p>
+            <w:r>
+              <w:rPr>
+                <w:sz w:val="18"/>
+              </w:rPr>
+              <w:t>ad_active</w:t>
+            </w:r>
+          </w:p>
+        </w:tc>
+        <w:tc>
+          <w:tcPr>
+            <w:tcW w:type="dxa" w:w="2268"/>
+            <w:shd w:fill="F2F2F2" w:val="clear"/>
+          </w:tcPr>
+          <w:p>
+            <w:r>
+              <w:rPr>
+                <w:sz w:val="18"/>
+              </w:rPr>
+              <w:t>ad_active</w:t>
+            </w:r>
+          </w:p>
+        </w:tc>
+        <w:tc>
+          <w:tcPr>
+            <w:tcW w:type="dxa" w:w="2551"/>
+            <w:shd w:fill="F2F2F2" w:val="clear"/>
+          </w:tcPr>
+          <w:p>
+            <w:r>
+              <w:rPr>
+                <w:sz w:val="18"/>
+              </w:rPr>
+              <w:t>— (бинарная)</w:t>
+            </w:r>
+          </w:p>
+        </w:tc>
+        <w:tc>
+          <w:tcPr>
+            <w:tcW w:type="dxa" w:w="3118"/>
+            <w:shd w:fill="F2F2F2" w:val="clear"/>
+          </w:tcPr>
+          <w:p>
+            <w:r>
+              <w:rPr>
+                <w:sz w:val="18"/>
+              </w:rPr>
+              <w:t>known_reals</w:t>
+            </w:r>
+          </w:p>
+        </w:tc>
+      </w:tr>
+      <w:tr>
+        <w:tc>
+          <w:tcPr>
+            <w:tcW w:type="dxa" w:w="2551"/>
+            <w:shd w:fill="FFFFFF" w:val="clear"/>
+          </w:tcPr>
+          <w:p>
+            <w:r>
+              <w:rPr>
+                <w:sz w:val="18"/>
+              </w:rPr>
+              <w:t>price_AI92/95/98 (3 к.)</w:t>
+            </w:r>
+          </w:p>
+        </w:tc>
+        <w:tc>
+          <w:tcPr>
+            <w:tcW w:type="dxa" w:w="2268"/>
+            <w:shd w:fill="FFFFFF" w:val="clear"/>
+          </w:tcPr>
+          <w:p>
+            <w:r>
+              <w:rPr>
+                <w:sz w:val="18"/>
+              </w:rPr>
+              <w:t>price_AI92/95/98</w:t>
+            </w:r>
+          </w:p>
+        </w:tc>
+        <w:tc>
+          <w:tcPr>
+            <w:tcW w:type="dxa" w:w="2551"/>
+            <w:shd w:fill="FFFFFF" w:val="clear"/>
+          </w:tcPr>
+          <w:p>
+            <w:r>
+              <w:rPr>
+                <w:sz w:val="18"/>
+              </w:rPr>
+              <w:t>Z-score per-station</w:t>
+            </w:r>
+          </w:p>
+        </w:tc>
+        <w:tc>
+          <w:tcPr>
+            <w:tcW w:type="dxa" w:w="3118"/>
+            <w:shd w:fill="FFFFFF" w:val="clear"/>
+          </w:tcPr>
+          <w:p>
+            <w:r>
+              <w:rPr>
+                <w:sz w:val="18"/>
+              </w:rPr>
+              <w:t>known_reals</w:t>
+            </w:r>
+          </w:p>
+        </w:tc>
+      </w:tr>
+      <w:tr>
+        <w:tc>
+          <w:tcPr>
+            <w:tcW w:type="dxa" w:w="2551"/>
+            <w:shd w:fill="F2F2F2" w:val="clear"/>
+          </w:tcPr>
+          <w:p>
+            <w:r>
+              <w:rPr>
+                <w:sz w:val="18"/>
+              </w:rPr>
+              <w:t>price_DT_* (4 к.)</w:t>
+            </w:r>
+          </w:p>
+        </w:tc>
+        <w:tc>
+          <w:tcPr>
+            <w:tcW w:type="dxa" w:w="2268"/>
+            <w:shd w:fill="F2F2F2" w:val="clear"/>
+          </w:tcPr>
+          <w:p>
+            <w:r>
+              <w:rPr>
+                <w:sz w:val="18"/>
+              </w:rPr>
+              <w:t>price_DT_*</w:t>
+            </w:r>
+          </w:p>
+        </w:tc>
+        <w:tc>
+          <w:tcPr>
+            <w:tcW w:type="dxa" w:w="2551"/>
+            <w:shd w:fill="F2F2F2" w:val="clear"/>
+          </w:tcPr>
+          <w:p>
+            <w:r>
+              <w:rPr>
+                <w:sz w:val="18"/>
+              </w:rPr>
+              <w:t>Z-score per-station (4 кол.)</w:t>
+            </w:r>
+          </w:p>
+        </w:tc>
+        <w:tc>
+          <w:tcPr>
+            <w:tcW w:type="dxa" w:w="3118"/>
+            <w:shd w:fill="F2F2F2" w:val="clear"/>
+          </w:tcPr>
+          <w:p>
+            <w:r>
+              <w:rPr>
+                <w:sz w:val="18"/>
+              </w:rPr>
+              <w:t>known_reals</w:t>
+            </w:r>
+          </w:p>
+        </w:tc>
+      </w:tr>
+      <w:tr>
+        <w:tc>
+          <w:tcPr>
+            <w:tcW w:type="dxa" w:w="2551"/>
+            <w:shd w:fill="FFFFFF" w:val="clear"/>
+          </w:tcPr>
+          <w:p>
+            <w:r>
+              <w:rPr>
+                <w:sz w:val="18"/>
+              </w:rPr>
+              <w:t>temperature</w:t>
+            </w:r>
+          </w:p>
+        </w:tc>
+        <w:tc>
+          <w:tcPr>
+            <w:tcW w:type="dxa" w:w="2268"/>
+            <w:shd w:fill="FFFFFF" w:val="clear"/>
+          </w:tcPr>
+          <w:p>
+            <w:r>
+              <w:rPr>
+                <w:sz w:val="18"/>
+              </w:rPr>
+              <w:t>temperature</w:t>
+            </w:r>
+          </w:p>
+        </w:tc>
+        <w:tc>
+          <w:tcPr>
+            <w:tcW w:type="dxa" w:w="2551"/>
+            <w:shd w:fill="FFFFFF" w:val="clear"/>
+          </w:tcPr>
+          <w:p>
+            <w:r>
+              <w:rPr>
+                <w:sz w:val="18"/>
+              </w:rPr>
+              <w:t>Winsorization + Z-score</w:t>
+            </w:r>
+          </w:p>
+        </w:tc>
+        <w:tc>
+          <w:tcPr>
+            <w:tcW w:type="dxa" w:w="3118"/>
+            <w:shd w:fill="FFFFFF" w:val="clear"/>
+          </w:tcPr>
+          <w:p>
+            <w:r>
+              <w:rPr>
+                <w:sz w:val="18"/>
+              </w:rPr>
+              <w:t>observed past (unknown_reals)</w:t>
+            </w:r>
+          </w:p>
+        </w:tc>
+      </w:tr>
+      <w:tr>
+        <w:tc>
+          <w:tcPr>
+            <w:tcW w:type="dxa" w:w="2551"/>
+            <w:shd w:fill="F2F2F2" w:val="clear"/>
+          </w:tcPr>
+          <w:p>
+            <w:r>
+              <w:rPr>
+                <w:sz w:val="18"/>
+              </w:rPr>
+              <w:t>precipitation_mm</w:t>
+            </w:r>
+          </w:p>
+        </w:tc>
+        <w:tc>
+          <w:tcPr>
+            <w:tcW w:type="dxa" w:w="2268"/>
+            <w:shd w:fill="F2F2F2" w:val="clear"/>
+          </w:tcPr>
+          <w:p>
+            <w:r>
+              <w:rPr>
+                <w:sz w:val="18"/>
+              </w:rPr>
+              <w:t>precipitation_mm</w:t>
+            </w:r>
+          </w:p>
+        </w:tc>
+        <w:tc>
+          <w:tcPr>
+            <w:tcW w:type="dxa" w:w="2551"/>
+            <w:shd w:fill="F2F2F2" w:val="clear"/>
+          </w:tcPr>
+          <w:p>
+            <w:r>
+              <w:rPr>
+                <w:sz w:val="18"/>
+              </w:rPr>
+              <w:t>Winsorization + Z-score</w:t>
+            </w:r>
+          </w:p>
+        </w:tc>
+        <w:tc>
+          <w:tcPr>
+            <w:tcW w:type="dxa" w:w="3118"/>
+            <w:shd w:fill="F2F2F2" w:val="clear"/>
+          </w:tcPr>
+          <w:p>
+            <w:r>
+              <w:rPr>
+                <w:sz w:val="18"/>
+              </w:rPr>
+              <w:t>observed past (unknown_reals)</w:t>
+            </w:r>
+          </w:p>
+        </w:tc>
+      </w:tr>
+      <w:tr>
+        <w:tc>
+          <w:tcPr>
+            <w:tcW w:type="dxa" w:w="2551"/>
+            <w:shd w:fill="FFFFFF" w:val="clear"/>
+          </w:tcPr>
+          <w:p>
+            <w:r>
+              <w:rPr>
+                <w:sz w:val="18"/>
+              </w:rPr>
+              <w:t>visibility_km</w:t>
+            </w:r>
+          </w:p>
+        </w:tc>
+        <w:tc>
+          <w:tcPr>
+            <w:tcW w:type="dxa" w:w="2268"/>
+            <w:shd w:fill="FFFFFF" w:val="clear"/>
+          </w:tcPr>
+          <w:p>
+            <w:r>
+              <w:rPr>
+                <w:sz w:val="18"/>
+              </w:rPr>
+              <w:t>visibility_km</w:t>
+            </w:r>
+          </w:p>
+        </w:tc>
+        <w:tc>
+          <w:tcPr>
+            <w:tcW w:type="dxa" w:w="2551"/>
+            <w:shd w:fill="FFFFFF" w:val="clear"/>
+          </w:tcPr>
+          <w:p>
+            <w:r>
+              <w:rPr>
+                <w:sz w:val="18"/>
+              </w:rPr>
+              <w:t>Winsorization + Z-score</w:t>
+            </w:r>
+          </w:p>
+        </w:tc>
+        <w:tc>
+          <w:tcPr>
+            <w:tcW w:type="dxa" w:w="3118"/>
+            <w:shd w:fill="FFFFFF" w:val="clear"/>
+          </w:tcPr>
+          <w:p>
+            <w:r>
+              <w:rPr>
+                <w:sz w:val="18"/>
+              </w:rPr>
+              <w:t>observed past (unknown_reals)</w:t>
+            </w:r>
+          </w:p>
+        </w:tc>
+      </w:tr>
+      <w:tr>
+        <w:tc>
+          <w:tcPr>
+            <w:tcW w:type="dxa" w:w="2551"/>
+            <w:shd w:fill="F2F2F2" w:val="clear"/>
+          </w:tcPr>
+          <w:p>
+            <w:r>
+              <w:rPr>
+                <w:sz w:val="18"/>
+              </w:rPr>
+              <w:t>wind_speed_ms</w:t>
+            </w:r>
+          </w:p>
+        </w:tc>
+        <w:tc>
+          <w:tcPr>
+            <w:tcW w:type="dxa" w:w="2268"/>
+            <w:shd w:fill="F2F2F2" w:val="clear"/>
+          </w:tcPr>
+          <w:p>
+            <w:r>
+              <w:rPr>
+                <w:sz w:val="18"/>
+              </w:rPr>
+              <w:t>wind_speed_ms</w:t>
+            </w:r>
+          </w:p>
+        </w:tc>
+        <w:tc>
+          <w:tcPr>
+            <w:tcW w:type="dxa" w:w="2551"/>
+            <w:shd w:fill="F2F2F2" w:val="clear"/>
+          </w:tcPr>
+          <w:p>
+            <w:r>
+              <w:rPr>
+                <w:sz w:val="18"/>
+              </w:rPr>
+              <w:t>Winsorization + Z-score</w:t>
+            </w:r>
+          </w:p>
+        </w:tc>
+        <w:tc>
+          <w:tcPr>
+            <w:tcW w:type="dxa" w:w="3118"/>
+            <w:shd w:fill="F2F2F2" w:val="clear"/>
+          </w:tcPr>
+          <w:p>
+            <w:r>
+              <w:rPr>
+                <w:sz w:val="18"/>
+              </w:rPr>
+              <w:t>observed past (unknown_reals)</w:t>
+            </w:r>
+          </w:p>
+        </w:tc>
+      </w:tr>
+      <w:tr>
+        <w:tc>
+          <w:tcPr>
+            <w:tcW w:type="dxa" w:w="2551"/>
+            <w:shd w:fill="FFFFFF" w:val="clear"/>
+          </w:tcPr>
+          <w:p>
+            <w:r>
+              <w:rPr>
+                <w:sz w:val="18"/>
+              </w:rPr>
+              <w:t>is_snow / is_rain / is_fog</w:t>
+            </w:r>
+          </w:p>
+        </w:tc>
+        <w:tc>
+          <w:tcPr>
+            <w:tcW w:type="dxa" w:w="2268"/>
+            <w:shd w:fill="FFFFFF" w:val="clear"/>
+          </w:tcPr>
+          <w:p>
+            <w:r>
+              <w:rPr>
+                <w:sz w:val="18"/>
+              </w:rPr>
+              <w:t>is_snow/rain/fog</w:t>
+            </w:r>
+          </w:p>
+        </w:tc>
+        <w:tc>
+          <w:tcPr>
+            <w:tcW w:type="dxa" w:w="2551"/>
+            <w:shd w:fill="FFFFFF" w:val="clear"/>
+          </w:tcPr>
+          <w:p>
+            <w:r>
+              <w:rPr>
+                <w:sz w:val="18"/>
+              </w:rPr>
+              <w:t>— (бинарные, 3 кол.)</w:t>
+            </w:r>
+          </w:p>
+        </w:tc>
+        <w:tc>
+          <w:tcPr>
+            <w:tcW w:type="dxa" w:w="3118"/>
+            <w:shd w:fill="FFFFFF" w:val="clear"/>
+          </w:tcPr>
+          <w:p>
+            <w:r>
+              <w:rPr>
+                <w:sz w:val="18"/>
+              </w:rPr>
+              <w:t>observed past (unknown_reals)</w:t>
+            </w:r>
+          </w:p>
+        </w:tc>
+      </w:tr>
+      <w:tr>
+        <w:tc>
+          <w:tcPr>
+            <w:tcW w:type="dxa" w:w="2551"/>
+            <w:shd w:fill="F2F2F2" w:val="clear"/>
+          </w:tcPr>
+          <w:p>
+            <w:r>
+              <w:rPr>
+                <w:sz w:val="18"/>
+              </w:rPr>
+              <w:t>weather_condition</w:t>
+            </w:r>
+          </w:p>
+        </w:tc>
+        <w:tc>
+          <w:tcPr>
+            <w:tcW w:type="dxa" w:w="2268"/>
+            <w:shd w:fill="F2F2F2" w:val="clear"/>
+          </w:tcPr>
+          <w:p>
+            <w:r>
+              <w:rPr>
+                <w:sz w:val="18"/>
+              </w:rPr>
+              <w:t>weather_condition</w:t>
+            </w:r>
+          </w:p>
+        </w:tc>
+        <w:tc>
+          <w:tcPr>
+            <w:tcW w:type="dxa" w:w="2551"/>
+            <w:shd w:fill="F2F2F2" w:val="clear"/>
+          </w:tcPr>
+          <w:p>
+            <w:r>
+              <w:rPr>
+                <w:sz w:val="18"/>
+              </w:rPr>
+              <w:t>Winsorization + Z-score</w:t>
+            </w:r>
+          </w:p>
+        </w:tc>
+        <w:tc>
+          <w:tcPr>
+            <w:tcW w:type="dxa" w:w="3118"/>
+            <w:shd w:fill="F2F2F2" w:val="clear"/>
+          </w:tcPr>
+          <w:p>
+            <w:r>
+              <w:rPr>
+                <w:sz w:val="18"/>
+              </w:rPr>
+              <w:t>observed past (unknown_reals)</w:t>
+            </w:r>
+          </w:p>
+        </w:tc>
+      </w:tr>
+      <w:tr>
+        <w:tc>
+          <w:tcPr>
+            <w:tcW w:type="dxa" w:w="2551"/>
+            <w:shd w:fill="FFFFFF" w:val="clear"/>
+          </w:tcPr>
+          <w:p>
+            <w:r>
+              <w:rPr>
+                <w:sz w:val="18"/>
+              </w:rPr>
+              <w:t>traffic_Passengers_cars</w:t>
+            </w:r>
+          </w:p>
+        </w:tc>
+        <w:tc>
+          <w:tcPr>
+            <w:tcW w:type="dxa" w:w="2268"/>
+            <w:shd w:fill="FFFFFF" w:val="clear"/>
+          </w:tcPr>
+          <w:p>
+            <w:r>
+              <w:rPr>
+                <w:sz w:val="18"/>
+              </w:rPr>
+              <w:t>traffic_Passengers_cars</w:t>
+            </w:r>
+          </w:p>
+        </w:tc>
+        <w:tc>
+          <w:tcPr>
+            <w:tcW w:type="dxa" w:w="2551"/>
+            <w:shd w:fill="FFFFFF" w:val="clear"/>
+          </w:tcPr>
+          <w:p>
+            <w:r>
+              <w:rPr>
+                <w:sz w:val="18"/>
+              </w:rPr>
+              <w:t>Winsorization + Z-score</w:t>
+            </w:r>
+          </w:p>
+        </w:tc>
+        <w:tc>
+          <w:tcPr>
+            <w:tcW w:type="dxa" w:w="3118"/>
+            <w:shd w:fill="FFFFFF" w:val="clear"/>
+          </w:tcPr>
+          <w:p>
+            <w:r>
+              <w:rPr>
+                <w:sz w:val="18"/>
+              </w:rPr>
+              <w:t>observed past (unknown_reals)</w:t>
+            </w:r>
+          </w:p>
+        </w:tc>
+      </w:tr>
+      <w:tr>
+        <w:tc>
+          <w:tcPr>
+            <w:tcW w:type="dxa" w:w="2551"/>
+            <w:shd w:fill="F2F2F2" w:val="clear"/>
+          </w:tcPr>
+          <w:p>
+            <w:r>
+              <w:rPr>
+                <w:sz w:val="18"/>
+              </w:rPr>
+              <w:t>traffic_Truck_short</w:t>
+            </w:r>
+          </w:p>
+        </w:tc>
+        <w:tc>
+          <w:tcPr>
+            <w:tcW w:type="dxa" w:w="2268"/>
+            <w:shd w:fill="F2F2F2" w:val="clear"/>
+          </w:tcPr>
+          <w:p>
+            <w:r>
+              <w:rPr>
+                <w:sz w:val="18"/>
+              </w:rPr>
+              <w:t>traffic_Truck_short</w:t>
+            </w:r>
+          </w:p>
+        </w:tc>
+        <w:tc>
+          <w:tcPr>
+            <w:tcW w:type="dxa" w:w="2551"/>
+            <w:shd w:fill="F2F2F2" w:val="clear"/>
+          </w:tcPr>
+          <w:p>
+            <w:r>
+              <w:rPr>
+                <w:sz w:val="18"/>
+              </w:rPr>
+              <w:t>Winsorization + Z-score</w:t>
+            </w:r>
+          </w:p>
+        </w:tc>
+        <w:tc>
+          <w:tcPr>
+            <w:tcW w:type="dxa" w:w="3118"/>
+            <w:shd w:fill="F2F2F2" w:val="clear"/>
+          </w:tcPr>
+          <w:p>
+            <w:r>
+              <w:rPr>
+                <w:sz w:val="18"/>
+              </w:rPr>
+              <w:t>observed past (unknown_reals)</w:t>
+            </w:r>
+          </w:p>
+        </w:tc>
+      </w:tr>
+      <w:tr>
+        <w:tc>
+          <w:tcPr>
+            <w:tcW w:type="dxa" w:w="2551"/>
+            <w:shd w:fill="FFFFFF" w:val="clear"/>
+          </w:tcPr>
+          <w:p>
+            <w:r>
+              <w:rPr>
+                <w:sz w:val="18"/>
+              </w:rPr>
+              <w:t>traffic_Truck</w:t>
+            </w:r>
+          </w:p>
+        </w:tc>
+        <w:tc>
+          <w:tcPr>
+            <w:tcW w:type="dxa" w:w="2268"/>
+            <w:shd w:fill="FFFFFF" w:val="clear"/>
+          </w:tcPr>
+          <w:p>
+            <w:r>
+              <w:rPr>
+                <w:sz w:val="18"/>
+              </w:rPr>
+              <w:t>traffic_Truck</w:t>
+            </w:r>
+          </w:p>
+        </w:tc>
+        <w:tc>
+          <w:tcPr>
+            <w:tcW w:type="dxa" w:w="2551"/>
+            <w:shd w:fill="FFFFFF" w:val="clear"/>
+          </w:tcPr>
+          <w:p>
+            <w:r>
+              <w:rPr>
+                <w:sz w:val="18"/>
+              </w:rPr>
+              <w:t>Winsorization + Z-score</w:t>
+            </w:r>
+          </w:p>
+        </w:tc>
+        <w:tc>
+          <w:tcPr>
+            <w:tcW w:type="dxa" w:w="3118"/>
+            <w:shd w:fill="FFFFFF" w:val="clear"/>
+          </w:tcPr>
+          <w:p>
+            <w:r>
+              <w:rPr>
+                <w:sz w:val="18"/>
+              </w:rPr>
+              <w:t>observed past (unknown_reals)</w:t>
+            </w:r>
+          </w:p>
+        </w:tc>
+      </w:tr>
+      <w:tr>
+        <w:tc>
+          <w:tcPr>
+            <w:tcW w:type="dxa" w:w="2551"/>
+            <w:shd w:fill="F2F2F2" w:val="clear"/>
+          </w:tcPr>
+          <w:p>
+            <w:r>
+              <w:rPr>
+                <w:sz w:val="18"/>
+              </w:rPr>
+              <w:t>traffic_Truck_long</w:t>
+            </w:r>
+          </w:p>
+        </w:tc>
+        <w:tc>
+          <w:tcPr>
+            <w:tcW w:type="dxa" w:w="2268"/>
+            <w:shd w:fill="F2F2F2" w:val="clear"/>
+          </w:tcPr>
+          <w:p>
+            <w:r>
+              <w:rPr>
+                <w:sz w:val="18"/>
+              </w:rPr>
+              <w:t>traffic_Truck_long</w:t>
+            </w:r>
+          </w:p>
+        </w:tc>
+        <w:tc>
+          <w:tcPr>
+            <w:tcW w:type="dxa" w:w="2551"/>
+            <w:shd w:fill="F2F2F2" w:val="clear"/>
+          </w:tcPr>
+          <w:p>
+            <w:r>
+              <w:rPr>
+                <w:sz w:val="18"/>
+              </w:rPr>
+              <w:t>Winsorization + Z-score</w:t>
+            </w:r>
+          </w:p>
+        </w:tc>
+        <w:tc>
+          <w:tcPr>
+            <w:tcW w:type="dxa" w:w="3118"/>
+            <w:shd w:fill="F2F2F2" w:val="clear"/>
+          </w:tcPr>
+          <w:p>
+            <w:r>
+              <w:rPr>
+                <w:sz w:val="18"/>
+              </w:rPr>
+              <w:t>observed past (unknown_reals)</w:t>
+            </w:r>
+          </w:p>
+        </w:tc>
+      </w:tr>
+      <w:tr>
+        <w:tc>
+          <w:tcPr>
+            <w:tcW w:type="dxa" w:w="2551"/>
+            <w:shd w:fill="FFFFFF" w:val="clear"/>
+          </w:tcPr>
+          <w:p>
+            <w:r>
+              <w:rPr>
+                <w:sz w:val="18"/>
+              </w:rPr>
+              <w:t>traffic_Transporter</w:t>
+            </w:r>
+          </w:p>
+        </w:tc>
+        <w:tc>
+          <w:tcPr>
+            <w:tcW w:type="dxa" w:w="2268"/>
+            <w:shd w:fill="FFFFFF" w:val="clear"/>
+          </w:tcPr>
+          <w:p>
+            <w:r>
+              <w:rPr>
+                <w:sz w:val="18"/>
+              </w:rPr>
+              <w:t>traffic_Transporter</w:t>
+            </w:r>
+          </w:p>
+        </w:tc>
+        <w:tc>
+          <w:tcPr>
+            <w:tcW w:type="dxa" w:w="2551"/>
+            <w:shd w:fill="FFFFFF" w:val="clear"/>
+          </w:tcPr>
+          <w:p>
+            <w:r>
+              <w:rPr>
+                <w:sz w:val="18"/>
+              </w:rPr>
+              <w:t>Winsorization + Z-score</w:t>
+            </w:r>
+          </w:p>
+        </w:tc>
+        <w:tc>
+          <w:tcPr>
+            <w:tcW w:type="dxa" w:w="3118"/>
+            <w:shd w:fill="FFFFFF" w:val="clear"/>
+          </w:tcPr>
+          <w:p>
+            <w:r>
+              <w:rPr>
+                <w:sz w:val="18"/>
+              </w:rPr>
+              <w:t>observed past (unknown_reals)</w:t>
+            </w:r>
+          </w:p>
+        </w:tc>
+      </w:tr>
+      <w:tr>
+        <w:tc>
+          <w:tcPr>
+            <w:tcW w:type="dxa" w:w="2551"/>
+            <w:shd w:fill="F2F2F2" w:val="clear"/>
+          </w:tcPr>
+          <w:p>
+            <w:r>
+              <w:rPr>
+                <w:sz w:val="18"/>
+              </w:rPr>
+              <w:t>traffic_Undefined</w:t>
+            </w:r>
+          </w:p>
+        </w:tc>
+        <w:tc>
+          <w:tcPr>
+            <w:tcW w:type="dxa" w:w="2268"/>
+            <w:shd w:fill="F2F2F2" w:val="clear"/>
+          </w:tcPr>
+          <w:p>
+            <w:r>
+              <w:rPr>
+                <w:sz w:val="18"/>
+              </w:rPr>
+              <w:t>traffic_Undefined</w:t>
+            </w:r>
+          </w:p>
+        </w:tc>
+        <w:tc>
+          <w:tcPr>
+            <w:tcW w:type="dxa" w:w="2551"/>
+            <w:shd w:fill="F2F2F2" w:val="clear"/>
+          </w:tcPr>
+          <w:p>
+            <w:r>
+              <w:rPr>
+                <w:sz w:val="18"/>
+              </w:rPr>
+              <w:t>Winsorization + Z-score</w:t>
+            </w:r>
+          </w:p>
+        </w:tc>
+        <w:tc>
+          <w:tcPr>
+            <w:tcW w:type="dxa" w:w="3118"/>
+            <w:shd w:fill="F2F2F2" w:val="clear"/>
+          </w:tcPr>
+          <w:p>
+            <w:r>
+              <w:rPr>
+                <w:sz w:val="18"/>
+              </w:rPr>
+              <w:t>observed past (unknown_reals)</w:t>
+            </w:r>
+          </w:p>
+        </w:tc>
+      </w:tr>
+      <w:tr>
+        <w:tc>
+          <w:tcPr>
+            <w:tcW w:type="dxa" w:w="2551"/>
+            <w:shd w:fill="FFFFFF" w:val="clear"/>
+          </w:tcPr>
+          <w:p>
+            <w:r>
+              <w:rPr>
+                <w:sz w:val="18"/>
+              </w:rPr>
+              <w:t>total_traffic</w:t>
+            </w:r>
+          </w:p>
+        </w:tc>
+        <w:tc>
+          <w:tcPr>
+            <w:tcW w:type="dxa" w:w="2268"/>
+            <w:shd w:fill="FFFFFF" w:val="clear"/>
+          </w:tcPr>
+          <w:p>
+            <w:r>
+              <w:rPr>
+                <w:sz w:val="18"/>
+              </w:rPr>
+              <w:t>total_traffic</w:t>
+            </w:r>
+          </w:p>
+        </w:tc>
+        <w:tc>
+          <w:tcPr>
+            <w:tcW w:type="dxa" w:w="2551"/>
+            <w:shd w:fill="FFFFFF" w:val="clear"/>
+          </w:tcPr>
+          <w:p>
+            <w:r>
+              <w:rPr>
+                <w:sz w:val="18"/>
+              </w:rPr>
+              <w:t>Winsorization + Z-score</w:t>
+            </w:r>
+          </w:p>
+        </w:tc>
+        <w:tc>
+          <w:tcPr>
+            <w:tcW w:type="dxa" w:w="3118"/>
+            <w:shd w:fill="FFFFFF" w:val="clear"/>
+          </w:tcPr>
+          <w:p>
+            <w:r>
+              <w:rPr>
+                <w:sz w:val="18"/>
+              </w:rPr>
+              <w:t>observed past (unknown_reals)</w:t>
+            </w:r>
+          </w:p>
+        </w:tc>
+      </w:tr>
+      <w:tr>
+        <w:tc>
+          <w:tcPr>
+            <w:tcW w:type="dxa" w:w="2551"/>
+            <w:shd w:fill="F2F2F2" w:val="clear"/>
+          </w:tcPr>
+          <w:p>
+            <w:r>
+              <w:rPr>
+                <w:sz w:val="18"/>
+              </w:rPr>
+              <w:t>shop_total_revenue</w:t>
+            </w:r>
+          </w:p>
+        </w:tc>
+        <w:tc>
+          <w:tcPr>
+            <w:tcW w:type="dxa" w:w="2268"/>
+            <w:shd w:fill="F2F2F2" w:val="clear"/>
+          </w:tcPr>
+          <w:p>
+            <w:r>
+              <w:rPr>
+                <w:sz w:val="18"/>
+              </w:rPr>
+              <w:t>shop_total_revenue</w:t>
+            </w:r>
+          </w:p>
+        </w:tc>
+        <w:tc>
+          <w:tcPr>
+            <w:tcW w:type="dxa" w:w="2551"/>
+            <w:shd w:fill="F2F2F2" w:val="clear"/>
+          </w:tcPr>
+          <w:p>
+            <w:r>
+              <w:rPr>
+                <w:sz w:val="18"/>
+              </w:rPr>
+              <w:t>log1p</w:t>
+            </w:r>
+          </w:p>
+        </w:tc>
+        <w:tc>
+          <w:tcPr>
+            <w:tcW w:type="dxa" w:w="3118"/>
+            <w:shd w:fill="F2F2F2" w:val="clear"/>
+          </w:tcPr>
+          <w:p>
+            <w:r>
+              <w:rPr>
+                <w:sz w:val="18"/>
+              </w:rPr>
+              <w:t>observed past (unknown_reals)</w:t>
+            </w:r>
+          </w:p>
+        </w:tc>
+      </w:tr>
+      <w:tr>
+        <w:tc>
+          <w:tcPr>
+            <w:tcW w:type="dxa" w:w="2551"/>
+            <w:shd w:fill="FFFFFF" w:val="clear"/>
+          </w:tcPr>
+          <w:p>
+            <w:r>
+              <w:rPr>
+                <w:sz w:val="18"/>
+              </w:rPr>
+              <w:t>competitor_price_AI92</w:t>
+            </w:r>
+          </w:p>
+        </w:tc>
+        <w:tc>
+          <w:tcPr>
+            <w:tcW w:type="dxa" w:w="2268"/>
+            <w:shd w:fill="FFFFFF" w:val="clear"/>
+          </w:tcPr>
+          <w:p>
+            <w:r>
+              <w:rPr>
+                <w:sz w:val="18"/>
+              </w:rPr>
+              <w:t>competitor_price_AI92</w:t>
+            </w:r>
+          </w:p>
+        </w:tc>
+        <w:tc>
+          <w:tcPr>
+            <w:tcW w:type="dxa" w:w="2551"/>
+            <w:shd w:fill="FFFFFF" w:val="clear"/>
+          </w:tcPr>
+          <w:p>
+            <w:r>
+              <w:rPr>
+                <w:sz w:val="18"/>
+              </w:rPr>
+              <w:t>Winsorization + Z-score</w:t>
+            </w:r>
+          </w:p>
+        </w:tc>
+        <w:tc>
+          <w:tcPr>
+            <w:tcW w:type="dxa" w:w="3118"/>
+            <w:shd w:fill="FFFFFF" w:val="clear"/>
+          </w:tcPr>
+          <w:p>
+            <w:r>
+              <w:rPr>
+                <w:sz w:val="18"/>
+              </w:rPr>
+              <w:t>observed past (unknown_reals)</w:t>
+            </w:r>
+          </w:p>
+        </w:tc>
+      </w:tr>
+      <w:tr>
+        <w:tc>
+          <w:tcPr>
+            <w:tcW w:type="dxa" w:w="2551"/>
+            <w:shd w:fill="F2F2F2" w:val="clear"/>
+          </w:tcPr>
+          <w:p>
+            <w:r>
+              <w:rPr>
+                <w:sz w:val="18"/>
+              </w:rPr>
+              <w:t>competitor_price_AI95</w:t>
+            </w:r>
+          </w:p>
+        </w:tc>
+        <w:tc>
+          <w:tcPr>
+            <w:tcW w:type="dxa" w:w="2268"/>
+            <w:shd w:fill="F2F2F2" w:val="clear"/>
+          </w:tcPr>
+          <w:p>
+            <w:r>
+              <w:rPr>
+                <w:sz w:val="18"/>
+              </w:rPr>
+              <w:t>competitor_price_AI95</w:t>
+            </w:r>
+          </w:p>
+        </w:tc>
+        <w:tc>
+          <w:tcPr>
+            <w:tcW w:type="dxa" w:w="2551"/>
+            <w:shd w:fill="F2F2F2" w:val="clear"/>
+          </w:tcPr>
+          <w:p>
+            <w:r>
+              <w:rPr>
+                <w:sz w:val="18"/>
+              </w:rPr>
+              <w:t>Winsorization + Z-score</w:t>
+            </w:r>
+          </w:p>
+        </w:tc>
+        <w:tc>
+          <w:tcPr>
+            <w:tcW w:type="dxa" w:w="3118"/>
+            <w:shd w:fill="F2F2F2" w:val="clear"/>
+          </w:tcPr>
+          <w:p>
+            <w:r>
+              <w:rPr>
+                <w:sz w:val="18"/>
+              </w:rPr>
+              <w:t>observed past (unknown_reals)</w:t>
+            </w:r>
+          </w:p>
+        </w:tc>
+      </w:tr>
+      <w:tr>
+        <w:tc>
+          <w:tcPr>
+            <w:tcW w:type="dxa" w:w="2551"/>
+            <w:shd w:fill="FFFFFF" w:val="clear"/>
+          </w:tcPr>
+          <w:p>
+            <w:r>
+              <w:rPr>
+                <w:sz w:val="18"/>
+              </w:rPr>
+              <w:t>competitor_price_DT</w:t>
+            </w:r>
+          </w:p>
+        </w:tc>
+        <w:tc>
+          <w:tcPr>
+            <w:tcW w:type="dxa" w:w="2268"/>
+            <w:shd w:fill="FFFFFF" w:val="clear"/>
+          </w:tcPr>
+          <w:p>
+            <w:r>
+              <w:rPr>
+                <w:sz w:val="18"/>
+              </w:rPr>
+              <w:t>competitor_price_DT</w:t>
+            </w:r>
+          </w:p>
+        </w:tc>
+        <w:tc>
+          <w:tcPr>
+            <w:tcW w:type="dxa" w:w="2551"/>
+            <w:shd w:fill="FFFFFF" w:val="clear"/>
+          </w:tcPr>
+          <w:p>
+            <w:r>
+              <w:rPr>
+                <w:sz w:val="18"/>
+              </w:rPr>
+              <w:t>Winsorization + Z-score</w:t>
+            </w:r>
+          </w:p>
+        </w:tc>
+        <w:tc>
+          <w:tcPr>
+            <w:tcW w:type="dxa" w:w="3118"/>
+            <w:shd w:fill="FFFFFF" w:val="clear"/>
+          </w:tcPr>
+          <w:p>
+            <w:r>
+              <w:rPr>
+                <w:sz w:val="18"/>
+              </w:rPr>
+              <w:t>observed past (unknown_reals)</w:t>
+            </w:r>
+          </w:p>
+        </w:tc>
+      </w:tr>
+      <w:tr>
+        <w:tc>
+          <w:tcPr>
+            <w:tcW w:type="dxa" w:w="2551"/>
+            <w:shd w:fill="F2F2F2" w:val="clear"/>
+          </w:tcPr>
+          <w:p>
+            <w:r>
+              <w:rPr>
+                <w:sz w:val="18"/>
+              </w:rPr>
+              <w:t>sales_AI92/95/98 (3 к.)</w:t>
+            </w:r>
+          </w:p>
+        </w:tc>
+        <w:tc>
+          <w:tcPr>
+            <w:tcW w:type="dxa" w:w="2268"/>
+            <w:shd w:fill="F2F2F2" w:val="clear"/>
+          </w:tcPr>
+          <w:p>
+            <w:r>
+              <w:rPr>
+                <w:sz w:val="18"/>
+              </w:rPr>
+              <w:t>sales_AI92/95/98</w:t>
+            </w:r>
+          </w:p>
+        </w:tc>
+        <w:tc>
+          <w:tcPr>
+            <w:tcW w:type="dxa" w:w="2551"/>
+            <w:shd w:fill="F2F2F2" w:val="clear"/>
+          </w:tcPr>
+          <w:p>
+            <w:r>
+              <w:rPr>
+                <w:sz w:val="18"/>
+              </w:rPr>
+              <w:t>log1p + TorchNormalizer(robust)</w:t>
+            </w:r>
+          </w:p>
+        </w:tc>
+        <w:tc>
+          <w:tcPr>
+            <w:tcW w:type="dxa" w:w="3118"/>
+            <w:shd w:fill="F2F2F2" w:val="clear"/>
+          </w:tcPr>
+          <w:p>
+            <w:r>
+              <w:rPr>
+                <w:sz w:val="18"/>
+              </w:rPr>
+              <w:t>target + observed past в encoder</w:t>
+            </w:r>
+          </w:p>
+        </w:tc>
+      </w:tr>
+      <w:tr>
+        <w:tc>
+          <w:tcPr>
+            <w:tcW w:type="dxa" w:w="2551"/>
+            <w:shd w:fill="FFFFFF" w:val="clear"/>
+          </w:tcPr>
+          <w:p>
+            <w:r>
+              <w:rPr>
+                <w:sz w:val="18"/>
+              </w:rPr>
+              <w:t>sales_DT_* (4 к.)</w:t>
+            </w:r>
+          </w:p>
+        </w:tc>
+        <w:tc>
+          <w:tcPr>
+            <w:tcW w:type="dxa" w:w="2268"/>
+            <w:shd w:fill="FFFFFF" w:val="clear"/>
+          </w:tcPr>
+          <w:p>
+            <w:r>
+              <w:rPr>
+                <w:sz w:val="18"/>
+              </w:rPr>
+              <w:t>sales_DT_EURO/...</w:t>
+            </w:r>
+          </w:p>
+        </w:tc>
+        <w:tc>
+          <w:tcPr>
+            <w:tcW w:type="dxa" w:w="2551"/>
+            <w:shd w:fill="FFFFFF" w:val="clear"/>
+          </w:tcPr>
+          <w:p>
+            <w:r>
+              <w:rPr>
+                <w:sz w:val="18"/>
+              </w:rPr>
+              <w:t>log1p + TorchNormalizer(robust)</w:t>
+            </w:r>
+          </w:p>
+        </w:tc>
+        <w:tc>
+          <w:tcPr>
+            <w:tcW w:type="dxa" w:w="3118"/>
+            <w:shd w:fill="FFFFFF" w:val="clear"/>
+          </w:tcPr>
+          <w:p>
+            <w:r>
+              <w:rPr>
+                <w:sz w:val="18"/>
+              </w:rPr>
+              <w:t>target + observed past в encoder</w:t>
+            </w:r>
+          </w:p>
+        </w:tc>
+      </w:tr>
+      <w:tr>
+        <w:tc>
+          <w:tcPr>
+            <w:tcW w:type="dxa" w:w="2551"/>
+            <w:shd w:fill="F2F2F2" w:val="clear"/>
+          </w:tcPr>
+          <w:p>
+            <w:r>
+              <w:rPr>
+                <w:sz w:val="18"/>
+              </w:rPr>
+              <w:t>shop_* (5 к.)</w:t>
+            </w:r>
+          </w:p>
+        </w:tc>
+        <w:tc>
+          <w:tcPr>
+            <w:tcW w:type="dxa" w:w="2268"/>
+            <w:shd w:fill="F2F2F2" w:val="clear"/>
+          </w:tcPr>
+          <w:p>
+            <w:r>
+              <w:rPr>
+                <w:sz w:val="18"/>
+              </w:rPr>
+              <w:t>shop_напитки/...</w:t>
+            </w:r>
+          </w:p>
+        </w:tc>
+        <w:tc>
+          <w:tcPr>
+            <w:tcW w:type="dxa" w:w="2551"/>
+            <w:shd w:fill="F2F2F2" w:val="clear"/>
+          </w:tcPr>
+          <w:p>
+            <w:r>
+              <w:rPr>
+                <w:sz w:val="18"/>
+              </w:rPr>
+              <w:t>log1p + TorchNormalizer(robust)</w:t>
+            </w:r>
+          </w:p>
+        </w:tc>
+        <w:tc>
+          <w:tcPr>
+            <w:tcW w:type="dxa" w:w="3118"/>
+            <w:shd w:fill="F2F2F2" w:val="clear"/>
+          </w:tcPr>
+          <w:p>
+            <w:r>
+              <w:rPr>
+                <w:sz w:val="18"/>
+              </w:rPr>
+              <w:t>target + observed past в encoder</w:t>
+            </w:r>
+          </w:p>
+        </w:tc>
+      </w:tr>
+    </w:tbl>
+    <w:p/>
+    <w:p>
+      <w:pPr>
+        <w:pStyle w:val="Heading2"/>
+      </w:pPr>
+      <w:r>
+        <w:rPr>
+          <w:color w:val="2E74B5"/>
+        </w:rPr>
+        <w:t>5.1 Итоговое количество переменных по группам</w:t>
+      </w:r>
+    </w:p>
+    <w:tbl>
+      <w:tblPr>
+        <w:tblStyle w:val="TableGrid"/>
+        <w:tblW w:type="auto" w:w="0"/>
+        <w:jc w:val="left"/>
+        <w:tblLook w:firstColumn="1" w:firstRow="1" w:lastColumn="0" w:lastRow="0" w:noHBand="0" w:noVBand="1" w:val="04A0"/>
+      </w:tblPr>
+      <w:tblGrid>
+        <w:gridCol w:w="3230"/>
+        <w:gridCol w:w="3230"/>
+        <w:gridCol w:w="3230"/>
+      </w:tblGrid>
+      <w:tr>
+        <w:tc>
+          <w:tcPr>
+            <w:tcW w:type="dxa" w:w="3118"/>
+            <w:shd w:fill="2E74B5" w:val="clear"/>
+          </w:tcPr>
+          <w:p>
+            <w:r>
+              <w:rPr>
+                <w:b/>
+                <w:color w:val="FFFFFF"/>
+                <w:sz w:val="18"/>
+              </w:rPr>
+              <w:t>TFT-роль</w:t>
+            </w:r>
+          </w:p>
+        </w:tc>
+        <w:tc>
+          <w:tcPr>
+            <w:tcW w:type="dxa" w:w="1701"/>
+            <w:shd w:fill="2E74B5" w:val="clear"/>
+          </w:tcPr>
+          <w:p>
+            <w:r>
+              <w:rPr>
+                <w:b/>
+                <w:color w:val="FFFFFF"/>
+                <w:sz w:val="18"/>
+              </w:rPr>
+              <w:t>Кол-во колонок</w:t>
+            </w:r>
+          </w:p>
+        </w:tc>
+        <w:tc>
+          <w:tcPr>
+            <w:tcW w:type="dxa" w:w="5669"/>
+            <w:shd w:fill="2E74B5" w:val="clear"/>
+          </w:tcPr>
+          <w:p>
+            <w:r>
+              <w:rPr>
+                <w:b/>
+                <w:color w:val="FFFFFF"/>
+                <w:sz w:val="18"/>
+              </w:rPr>
+              <w:t>Примечание</w:t>
+            </w:r>
+          </w:p>
+        </w:tc>
+      </w:tr>
+      <w:tr>
+        <w:tc>
+          <w:tcPr>
+            <w:tcW w:type="dxa" w:w="3118"/>
+            <w:shd w:fill="F2F2F2" w:val="clear"/>
+          </w:tcPr>
+          <w:p>
+            <w:r>
+              <w:rPr>
+                <w:sz w:val="18"/>
+              </w:rPr>
+              <w:t>static_categoricals</w:t>
+            </w:r>
+          </w:p>
+        </w:tc>
+        <w:tc>
+          <w:tcPr>
+            <w:tcW w:type="dxa" w:w="1701"/>
+            <w:shd w:fill="F2F2F2" w:val="clear"/>
+          </w:tcPr>
+          <w:p>
+            <w:r>
+              <w:rPr>
+                <w:sz w:val="18"/>
+              </w:rPr>
+              <w:t>3</w:t>
+            </w:r>
+          </w:p>
+        </w:tc>
+        <w:tc>
+          <w:tcPr>
+            <w:tcW w:type="dxa" w:w="5669"/>
+            <w:shd w:fill="F2F2F2" w:val="clear"/>
+          </w:tcPr>
+          <w:p>
+            <w:r>
+              <w:rPr>
+                <w:sz w:val="18"/>
+              </w:rPr>
+              <w:t>Тип дороги, направление, размер поселения</w:t>
+            </w:r>
+          </w:p>
+        </w:tc>
+      </w:tr>
+      <w:tr>
+        <w:tc>
+          <w:tcPr>
+            <w:tcW w:type="dxa" w:w="3118"/>
+            <w:shd w:fill="FFFFFF" w:val="clear"/>
+          </w:tcPr>
+          <w:p>
+            <w:r>
+              <w:rPr>
+                <w:sz w:val="18"/>
+              </w:rPr>
+              <w:t>static_reals</w:t>
+            </w:r>
+          </w:p>
+        </w:tc>
+        <w:tc>
+          <w:tcPr>
+            <w:tcW w:type="dxa" w:w="1701"/>
+            <w:shd w:fill="FFFFFF" w:val="clear"/>
+          </w:tcPr>
+          <w:p>
+            <w:r>
+              <w:rPr>
+                <w:sz w:val="18"/>
+              </w:rPr>
+              <w:t>27</w:t>
+            </w:r>
+          </w:p>
+        </w:tc>
+        <w:tc>
+          <w:tcPr>
+            <w:tcW w:type="dxa" w:w="5669"/>
+            <w:shd w:fill="FFFFFF" w:val="clear"/>
+          </w:tcPr>
+          <w:p>
+            <w:r>
+              <w:rPr>
+                <w:sz w:val="18"/>
+              </w:rPr>
+              <w:t>Паспортные характеристики АЗС</w:t>
+            </w:r>
+          </w:p>
+        </w:tc>
+      </w:tr>
+      <w:tr>
+        <w:tc>
+          <w:tcPr>
+            <w:tcW w:type="dxa" w:w="3118"/>
+            <w:shd w:fill="F2F2F2" w:val="clear"/>
+          </w:tcPr>
+          <w:p>
+            <w:r>
+              <w:rPr>
+                <w:sz w:val="18"/>
+              </w:rPr>
+              <w:t>known_categoricals</w:t>
+            </w:r>
+          </w:p>
+        </w:tc>
+        <w:tc>
+          <w:tcPr>
+            <w:tcW w:type="dxa" w:w="1701"/>
+            <w:shd w:fill="F2F2F2" w:val="clear"/>
+          </w:tcPr>
+          <w:p>
+            <w:r>
+              <w:rPr>
+                <w:sz w:val="18"/>
+              </w:rPr>
+              <w:t>4</w:t>
+            </w:r>
+          </w:p>
+        </w:tc>
+        <w:tc>
+          <w:tcPr>
+            <w:tcW w:type="dxa" w:w="5669"/>
+            <w:shd w:fill="F2F2F2" w:val="clear"/>
+          </w:tcPr>
+          <w:p>
+            <w:r>
+              <w:rPr>
+                <w:sz w:val="18"/>
+              </w:rPr>
+              <w:t>Сезон, день недели, канал рекламы, праздник</w:t>
+            </w:r>
+          </w:p>
+        </w:tc>
+      </w:tr>
+      <w:tr>
+        <w:tc>
+          <w:tcPr>
+            <w:tcW w:type="dxa" w:w="3118"/>
+            <w:shd w:fill="FFFFFF" w:val="clear"/>
+          </w:tcPr>
+          <w:p>
+            <w:r>
+              <w:rPr>
+                <w:sz w:val="18"/>
+              </w:rPr>
+              <w:t>known_reals</w:t>
+            </w:r>
+          </w:p>
+        </w:tc>
+        <w:tc>
+          <w:tcPr>
+            <w:tcW w:type="dxa" w:w="1701"/>
+            <w:shd w:fill="FFFFFF" w:val="clear"/>
+          </w:tcPr>
+          <w:p>
+            <w:r>
+              <w:rPr>
+                <w:sz w:val="18"/>
+              </w:rPr>
+              <w:t>28</w:t>
+            </w:r>
+          </w:p>
+        </w:tc>
+        <w:tc>
+          <w:tcPr>
+            <w:tcW w:type="dxa" w:w="5669"/>
+            <w:shd w:fill="FFFFFF" w:val="clear"/>
+          </w:tcPr>
+          <w:p>
+            <w:r>
+              <w:rPr>
+                <w:sz w:val="18"/>
+              </w:rPr>
+              <w:t>Время (8 цикл.), бинарные (7), цены (7), прочие (6)</w:t>
+            </w:r>
+          </w:p>
+        </w:tc>
+      </w:tr>
+      <w:tr>
+        <w:tc>
+          <w:tcPr>
+            <w:tcW w:type="dxa" w:w="3118"/>
+            <w:shd w:fill="F2F2F2" w:val="clear"/>
+          </w:tcPr>
+          <w:p>
+            <w:r>
+              <w:rPr>
+                <w:sz w:val="18"/>
+              </w:rPr>
+              <w:t>observed past (unknown_reals)</w:t>
+            </w:r>
+          </w:p>
+        </w:tc>
+        <w:tc>
+          <w:tcPr>
+            <w:tcW w:type="dxa" w:w="1701"/>
+            <w:shd w:fill="F2F2F2" w:val="clear"/>
+          </w:tcPr>
+          <w:p>
+            <w:r>
+              <w:rPr>
+                <w:sz w:val="18"/>
+              </w:rPr>
+              <w:t>19</w:t>
+            </w:r>
+          </w:p>
+        </w:tc>
+        <w:tc>
+          <w:tcPr>
+            <w:tcW w:type="dxa" w:w="5669"/>
+            <w:shd w:fill="F2F2F2" w:val="clear"/>
+          </w:tcPr>
+          <w:p>
+            <w:r>
+              <w:rPr>
+                <w:sz w:val="18"/>
+              </w:rPr>
+              <w:t>Погода (8), трафик (7), магазин (1), конкуренты (3)</w:t>
+            </w:r>
+          </w:p>
+        </w:tc>
+      </w:tr>
+      <w:tr>
+        <w:tc>
+          <w:tcPr>
+            <w:tcW w:type="dxa" w:w="3118"/>
+            <w:shd w:fill="FFFFFF" w:val="clear"/>
+          </w:tcPr>
+          <w:p>
+            <w:r>
+              <w:rPr>
+                <w:sz w:val="18"/>
+              </w:rPr>
+              <w:t>target / observed past encoder</w:t>
+            </w:r>
+          </w:p>
+        </w:tc>
+        <w:tc>
+          <w:tcPr>
+            <w:tcW w:type="dxa" w:w="1701"/>
+            <w:shd w:fill="FFFFFF" w:val="clear"/>
+          </w:tcPr>
+          <w:p>
+            <w:r>
+              <w:rPr>
+                <w:sz w:val="18"/>
+              </w:rPr>
+              <w:t>12</w:t>
+            </w:r>
+          </w:p>
+        </w:tc>
+        <w:tc>
+          <w:tcPr>
+            <w:tcW w:type="dxa" w:w="5669"/>
+            <w:shd w:fill="FFFFFF" w:val="clear"/>
+          </w:tcPr>
+          <w:p>
+            <w:r>
+              <w:rPr>
+                <w:sz w:val="18"/>
+              </w:rPr>
+              <w:t>7 видов топлива + 5 категорий магазина</w:t>
+            </w:r>
+          </w:p>
+        </w:tc>
+      </w:tr>
+      <w:tr>
+        <w:tc>
+          <w:tcPr>
+            <w:tcW w:type="dxa" w:w="3118"/>
+            <w:shd w:fill="F2F2F2" w:val="clear"/>
+          </w:tcPr>
+          <w:p>
+            <w:r>
+              <w:rPr>
+                <w:sz w:val="18"/>
+              </w:rPr>
+              <w:t>ИТОГО входных колонок</w:t>
+            </w:r>
+          </w:p>
+        </w:tc>
+        <w:tc>
+          <w:tcPr>
+            <w:tcW w:type="dxa" w:w="1701"/>
+            <w:shd w:fill="F2F2F2" w:val="clear"/>
+          </w:tcPr>
+          <w:p>
+            <w:r>
+              <w:rPr>
+                <w:sz w:val="18"/>
+              </w:rPr>
+              <w:t>93</w:t>
+            </w:r>
+          </w:p>
+        </w:tc>
+        <w:tc>
+          <w:tcPr>
+            <w:tcW w:type="dxa" w:w="5669"/>
+            <w:shd w:fill="F2F2F2" w:val="clear"/>
+          </w:tcPr>
+          <w:p>
+            <w:r>
+              <w:rPr>
+                <w:sz w:val="18"/>
+              </w:rPr>
+              <w:t>Без учёта time_idx и station_id</w:t>
+            </w:r>
+          </w:p>
+        </w:tc>
+      </w:tr>
+    </w:tbl>
     <w:sectPr>
       <w:pgSz w:w="12240" w:h="15840"/>
       <w:pgMar w:top="1134" w:right="1134" w:bottom="1134" w:left="1417" w:header="720" w:footer="720" w:gutter="0"/>

</xml_diff>

<commit_message>
docs(report): add section 5.2 — breakdown of 55 static / 64 encoder / 33 decoder features
Explains where the pytorch-forecasting tensor sizes come from:
- 55 static = 3 cats + 27 STATIC_REALS + 24 target scales + 1 encoder_length
- 64 encoder = 33 known + 19 unknown_reals + 12 targets (observed past)
- 33 decoder = 4 known_cats + 28 known_reals + 1 relative_time_idx

Co-Authored-By: Claude Sonnet 4.6 <noreply@anthropic.com>
</commit_message>
<xml_diff>
--- a/reports/tft_report.docx
+++ b/reports/tft_report.docx
@@ -9286,6 +9286,1183 @@
         </w:tc>
       </w:tr>
     </w:tbl>
+    <w:p/>
+    <w:p>
+      <w:pPr>
+        <w:pStyle w:val="Heading2"/>
+      </w:pPr>
+      <w:r>
+        <w:rPr>
+          <w:color w:val="2E74B5"/>
+        </w:rPr>
+        <w:t>5.2 Из чего складываются 55 статических, 64 прошлых, 33 будущих</w:t>
+      </w:r>
+    </w:p>
+    <w:p>
+      <w:r>
+        <w:rPr>
+          <w:b w:val="0"/>
+          <w:i w:val="0"/>
+          <w:sz w:val="20"/>
+        </w:rPr>
+        <w:t>Числа 55 / 64 / 33 — это фактические размеры тензоров, которые TFT получает на вход. Они включают не только исходные переменные, но и дополнительные признаки, автоматически добавляемые pytorch-forecasting при построении датасета.</w:t>
+      </w:r>
+    </w:p>
+    <w:p/>
+    <w:p>
+      <w:pPr>
+        <w:pStyle w:val="Heading3"/>
+      </w:pPr>
+      <w:r>
+        <w:rPr>
+          <w:color w:val="37868C"/>
+        </w:rPr>
+        <w:t>Статические признаки — 55</w:t>
+      </w:r>
+    </w:p>
+    <w:tbl>
+      <w:tblPr>
+        <w:tblStyle w:val="TableGrid"/>
+        <w:tblW w:type="auto" w:w="0"/>
+        <w:jc w:val="left"/>
+        <w:tblLook w:firstColumn="1" w:firstRow="1" w:lastColumn="0" w:lastRow="0" w:noHBand="0" w:noVBand="1" w:val="04A0"/>
+      </w:tblPr>
+      <w:tblGrid>
+        <w:gridCol w:w="2422"/>
+        <w:gridCol w:w="2422"/>
+        <w:gridCol w:w="2422"/>
+        <w:gridCol w:w="2422"/>
+      </w:tblGrid>
+      <w:tr>
+        <w:tc>
+          <w:tcPr>
+            <w:tcW w:type="dxa" w:w="2551"/>
+            <w:shd w:fill="1F3964" w:val="clear"/>
+          </w:tcPr>
+          <w:p>
+            <w:r>
+              <w:rPr>
+                <w:b/>
+                <w:color w:val="FFFFFF"/>
+                <w:sz w:val="18"/>
+              </w:rPr>
+              <w:t>Компонент</w:t>
+            </w:r>
+          </w:p>
+        </w:tc>
+        <w:tc>
+          <w:tcPr>
+            <w:tcW w:type="dxa" w:w="1134"/>
+            <w:shd w:fill="1F3964" w:val="clear"/>
+          </w:tcPr>
+          <w:p>
+            <w:r>
+              <w:rPr>
+                <w:b/>
+                <w:color w:val="FFFFFF"/>
+                <w:sz w:val="18"/>
+              </w:rPr>
+              <w:t>Кол-во</w:t>
+            </w:r>
+          </w:p>
+        </w:tc>
+        <w:tc>
+          <w:tcPr>
+            <w:tcW w:type="dxa" w:w="2551"/>
+            <w:shd w:fill="1F3964" w:val="clear"/>
+          </w:tcPr>
+          <w:p>
+            <w:r>
+              <w:rPr>
+                <w:b/>
+                <w:color w:val="FFFFFF"/>
+                <w:sz w:val="18"/>
+              </w:rPr>
+              <w:t>Параметр датасета</w:t>
+            </w:r>
+          </w:p>
+        </w:tc>
+        <w:tc>
+          <w:tcPr>
+            <w:tcW w:type="dxa" w:w="4252"/>
+            <w:shd w:fill="1F3964" w:val="clear"/>
+          </w:tcPr>
+          <w:p>
+            <w:r>
+              <w:rPr>
+                <w:b/>
+                <w:color w:val="FFFFFF"/>
+                <w:sz w:val="18"/>
+              </w:rPr>
+              <w:t>Описание</w:t>
+            </w:r>
+          </w:p>
+        </w:tc>
+      </w:tr>
+      <w:tr>
+        <w:tc>
+          <w:tcPr>
+            <w:tcW w:type="dxa" w:w="2551"/>
+            <w:shd w:fill="F2F2F2" w:val="clear"/>
+          </w:tcPr>
+          <w:p>
+            <w:r>
+              <w:rPr>
+                <w:sz w:val="18"/>
+              </w:rPr>
+              <w:t>static_categoricals</w:t>
+            </w:r>
+          </w:p>
+        </w:tc>
+        <w:tc>
+          <w:tcPr>
+            <w:tcW w:type="dxa" w:w="1134"/>
+            <w:shd w:fill="F2F2F2" w:val="clear"/>
+          </w:tcPr>
+          <w:p>
+            <w:r>
+              <w:rPr>
+                <w:sz w:val="18"/>
+              </w:rPr>
+              <w:t>3</w:t>
+            </w:r>
+          </w:p>
+        </w:tc>
+        <w:tc>
+          <w:tcPr>
+            <w:tcW w:type="dxa" w:w="2551"/>
+            <w:shd w:fill="F2F2F2" w:val="clear"/>
+          </w:tcPr>
+          <w:p>
+            <w:r>
+              <w:rPr>
+                <w:sz w:val="18"/>
+              </w:rPr>
+              <w:t>—</w:t>
+            </w:r>
+          </w:p>
+        </w:tc>
+        <w:tc>
+          <w:tcPr>
+            <w:tcW w:type="dxa" w:w="4252"/>
+            <w:shd w:fill="F2F2F2" w:val="clear"/>
+          </w:tcPr>
+          <w:p>
+            <w:r>
+              <w:rPr>
+                <w:sz w:val="18"/>
+              </w:rPr>
+              <w:t>road_type_enc, direction_enc, settlement_size_enc</w:t>
+            </w:r>
+          </w:p>
+        </w:tc>
+      </w:tr>
+      <w:tr>
+        <w:tc>
+          <w:tcPr>
+            <w:tcW w:type="dxa" w:w="2551"/>
+            <w:shd w:fill="FFFFFF" w:val="clear"/>
+          </w:tcPr>
+          <w:p>
+            <w:r>
+              <w:rPr>
+                <w:sz w:val="18"/>
+              </w:rPr>
+              <w:t>static_reals (паспорт АЗС)</w:t>
+            </w:r>
+          </w:p>
+        </w:tc>
+        <w:tc>
+          <w:tcPr>
+            <w:tcW w:type="dxa" w:w="1134"/>
+            <w:shd w:fill="FFFFFF" w:val="clear"/>
+          </w:tcPr>
+          <w:p>
+            <w:r>
+              <w:rPr>
+                <w:sz w:val="18"/>
+              </w:rPr>
+              <w:t>27</w:t>
+            </w:r>
+          </w:p>
+        </w:tc>
+        <w:tc>
+          <w:tcPr>
+            <w:tcW w:type="dxa" w:w="2551"/>
+            <w:shd w:fill="FFFFFF" w:val="clear"/>
+          </w:tcPr>
+          <w:p>
+            <w:r>
+              <w:rPr>
+                <w:sz w:val="18"/>
+              </w:rPr>
+              <w:t>—</w:t>
+            </w:r>
+          </w:p>
+        </w:tc>
+        <w:tc>
+          <w:tcPr>
+            <w:tcW w:type="dxa" w:w="4252"/>
+            <w:shd w:fill="FFFFFF" w:val="clear"/>
+          </w:tcPr>
+          <w:p>
+            <w:r>
+              <w:rPr>
+                <w:sz w:val="18"/>
+              </w:rPr>
+              <w:t>Расстояния, колонки, площадь, сервисы, базовые цены, оценки</w:t>
+            </w:r>
+          </w:p>
+        </w:tc>
+      </w:tr>
+      <w:tr>
+        <w:tc>
+          <w:tcPr>
+            <w:tcW w:type="dxa" w:w="2551"/>
+            <w:shd w:fill="F2F2F2" w:val="clear"/>
+          </w:tcPr>
+          <w:p>
+            <w:r>
+              <w:rPr>
+                <w:sz w:val="18"/>
+              </w:rPr>
+              <w:t>target scales</w:t>
+            </w:r>
+          </w:p>
+        </w:tc>
+        <w:tc>
+          <w:tcPr>
+            <w:tcW w:type="dxa" w:w="1134"/>
+            <w:shd w:fill="F2F2F2" w:val="clear"/>
+          </w:tcPr>
+          <w:p>
+            <w:r>
+              <w:rPr>
+                <w:sz w:val="18"/>
+              </w:rPr>
+              <w:t>24</w:t>
+            </w:r>
+          </w:p>
+        </w:tc>
+        <w:tc>
+          <w:tcPr>
+            <w:tcW w:type="dxa" w:w="2551"/>
+            <w:shd w:fill="F2F2F2" w:val="clear"/>
+          </w:tcPr>
+          <w:p>
+            <w:r>
+              <w:rPr>
+                <w:sz w:val="18"/>
+              </w:rPr>
+              <w:t>add_target_scales=True</w:t>
+            </w:r>
+          </w:p>
+        </w:tc>
+        <w:tc>
+          <w:tcPr>
+            <w:tcW w:type="dxa" w:w="4252"/>
+            <w:shd w:fill="F2F2F2" w:val="clear"/>
+          </w:tcPr>
+          <w:p>
+            <w:r>
+              <w:rPr>
+                <w:sz w:val="18"/>
+              </w:rPr>
+              <w:t>12 целей × 2: location (центр) + scale (масштаб) у TorchNormalizer(robust)</w:t>
+            </w:r>
+          </w:p>
+        </w:tc>
+      </w:tr>
+      <w:tr>
+        <w:tc>
+          <w:tcPr>
+            <w:tcW w:type="dxa" w:w="2551"/>
+            <w:shd w:fill="FFFFFF" w:val="clear"/>
+          </w:tcPr>
+          <w:p>
+            <w:r>
+              <w:rPr>
+                <w:sz w:val="18"/>
+              </w:rPr>
+              <w:t>encoder_length</w:t>
+            </w:r>
+          </w:p>
+        </w:tc>
+        <w:tc>
+          <w:tcPr>
+            <w:tcW w:type="dxa" w:w="1134"/>
+            <w:shd w:fill="FFFFFF" w:val="clear"/>
+          </w:tcPr>
+          <w:p>
+            <w:r>
+              <w:rPr>
+                <w:sz w:val="18"/>
+              </w:rPr>
+              <w:t>1</w:t>
+            </w:r>
+          </w:p>
+        </w:tc>
+        <w:tc>
+          <w:tcPr>
+            <w:tcW w:type="dxa" w:w="2551"/>
+            <w:shd w:fill="FFFFFF" w:val="clear"/>
+          </w:tcPr>
+          <w:p>
+            <w:r>
+              <w:rPr>
+                <w:sz w:val="18"/>
+              </w:rPr>
+              <w:t>add_encoder_length=True</w:t>
+            </w:r>
+          </w:p>
+        </w:tc>
+        <w:tc>
+          <w:tcPr>
+            <w:tcW w:type="dxa" w:w="4252"/>
+            <w:shd w:fill="FFFFFF" w:val="clear"/>
+          </w:tcPr>
+          <w:p>
+            <w:r>
+              <w:rPr>
+                <w:sz w:val="18"/>
+              </w:rPr>
+              <w:t>Фактическая длина энкодера в текущем сэмпле — подсказка для модели</w:t>
+            </w:r>
+          </w:p>
+        </w:tc>
+      </w:tr>
+      <w:tr>
+        <w:tc>
+          <w:tcPr>
+            <w:tcW w:type="dxa" w:w="2551"/>
+            <w:shd w:fill="F2F2F2" w:val="clear"/>
+          </w:tcPr>
+          <w:p>
+            <w:r>
+              <w:rPr>
+                <w:sz w:val="18"/>
+              </w:rPr>
+              <w:t>ИТОГО</w:t>
+            </w:r>
+          </w:p>
+        </w:tc>
+        <w:tc>
+          <w:tcPr>
+            <w:tcW w:type="dxa" w:w="1134"/>
+            <w:shd w:fill="F2F2F2" w:val="clear"/>
+          </w:tcPr>
+          <w:p>
+            <w:r>
+              <w:rPr>
+                <w:sz w:val="18"/>
+              </w:rPr>
+              <w:t>55</w:t>
+            </w:r>
+          </w:p>
+        </w:tc>
+        <w:tc>
+          <w:tcPr>
+            <w:tcW w:type="dxa" w:w="2551"/>
+            <w:shd w:fill="F2F2F2" w:val="clear"/>
+          </w:tcPr>
+          <w:p>
+            <w:r>
+              <w:rPr>
+                <w:sz w:val="18"/>
+              </w:rPr>
+              <w:t>—</w:t>
+            </w:r>
+          </w:p>
+        </w:tc>
+        <w:tc>
+          <w:tcPr>
+            <w:tcW w:type="dxa" w:w="4252"/>
+            <w:shd w:fill="F2F2F2" w:val="clear"/>
+          </w:tcPr>
+          <w:p>
+            <w:r>
+              <w:rPr>
+                <w:sz w:val="18"/>
+              </w:rPr>
+            </w:r>
+          </w:p>
+        </w:tc>
+      </w:tr>
+    </w:tbl>
+    <w:p/>
+    <w:p>
+      <w:pPr>
+        <w:pStyle w:val="Heading3"/>
+      </w:pPr>
+      <w:r>
+        <w:rPr>
+          <w:color w:val="37868C"/>
+        </w:rPr>
+        <w:t>Прошлые признаки (encoder_cont) — 64</w:t>
+      </w:r>
+    </w:p>
+    <w:tbl>
+      <w:tblPr>
+        <w:tblStyle w:val="TableGrid"/>
+        <w:tblW w:type="auto" w:w="0"/>
+        <w:jc w:val="left"/>
+        <w:tblLook w:firstColumn="1" w:firstRow="1" w:lastColumn="0" w:lastRow="0" w:noHBand="0" w:noVBand="1" w:val="04A0"/>
+      </w:tblPr>
+      <w:tblGrid>
+        <w:gridCol w:w="2422"/>
+        <w:gridCol w:w="2422"/>
+        <w:gridCol w:w="2422"/>
+        <w:gridCol w:w="2422"/>
+      </w:tblGrid>
+      <w:tr>
+        <w:tc>
+          <w:tcPr>
+            <w:tcW w:type="dxa" w:w="2551"/>
+            <w:shd w:fill="1F3964" w:val="clear"/>
+          </w:tcPr>
+          <w:p>
+            <w:r>
+              <w:rPr>
+                <w:b/>
+                <w:color w:val="FFFFFF"/>
+                <w:sz w:val="18"/>
+              </w:rPr>
+              <w:t>Компонент</w:t>
+            </w:r>
+          </w:p>
+        </w:tc>
+        <w:tc>
+          <w:tcPr>
+            <w:tcW w:type="dxa" w:w="1134"/>
+            <w:shd w:fill="1F3964" w:val="clear"/>
+          </w:tcPr>
+          <w:p>
+            <w:r>
+              <w:rPr>
+                <w:b/>
+                <w:color w:val="FFFFFF"/>
+                <w:sz w:val="18"/>
+              </w:rPr>
+              <w:t>Кол-во</w:t>
+            </w:r>
+          </w:p>
+        </w:tc>
+        <w:tc>
+          <w:tcPr>
+            <w:tcW w:type="dxa" w:w="2551"/>
+            <w:shd w:fill="1F3964" w:val="clear"/>
+          </w:tcPr>
+          <w:p>
+            <w:r>
+              <w:rPr>
+                <w:b/>
+                <w:color w:val="FFFFFF"/>
+                <w:sz w:val="18"/>
+              </w:rPr>
+              <w:t>Параметр датасета</w:t>
+            </w:r>
+          </w:p>
+        </w:tc>
+        <w:tc>
+          <w:tcPr>
+            <w:tcW w:type="dxa" w:w="4252"/>
+            <w:shd w:fill="1F3964" w:val="clear"/>
+          </w:tcPr>
+          <w:p>
+            <w:r>
+              <w:rPr>
+                <w:b/>
+                <w:color w:val="FFFFFF"/>
+                <w:sz w:val="18"/>
+              </w:rPr>
+              <w:t>Описание</w:t>
+            </w:r>
+          </w:p>
+        </w:tc>
+      </w:tr>
+      <w:tr>
+        <w:tc>
+          <w:tcPr>
+            <w:tcW w:type="dxa" w:w="2551"/>
+            <w:shd w:fill="F2F2F2" w:val="clear"/>
+          </w:tcPr>
+          <w:p>
+            <w:r>
+              <w:rPr>
+                <w:sz w:val="18"/>
+              </w:rPr>
+              <w:t>known_categoricals</w:t>
+            </w:r>
+          </w:p>
+        </w:tc>
+        <w:tc>
+          <w:tcPr>
+            <w:tcW w:type="dxa" w:w="1134"/>
+            <w:shd w:fill="F2F2F2" w:val="clear"/>
+          </w:tcPr>
+          <w:p>
+            <w:r>
+              <w:rPr>
+                <w:sz w:val="18"/>
+              </w:rPr>
+              <w:t>4</w:t>
+            </w:r>
+          </w:p>
+        </w:tc>
+        <w:tc>
+          <w:tcPr>
+            <w:tcW w:type="dxa" w:w="2551"/>
+            <w:shd w:fill="F2F2F2" w:val="clear"/>
+          </w:tcPr>
+          <w:p>
+            <w:r>
+              <w:rPr>
+                <w:sz w:val="18"/>
+              </w:rPr>
+              <w:t>—</w:t>
+            </w:r>
+          </w:p>
+        </w:tc>
+        <w:tc>
+          <w:tcPr>
+            <w:tcW w:type="dxa" w:w="4252"/>
+            <w:shd w:fill="F2F2F2" w:val="clear"/>
+          </w:tcPr>
+          <w:p>
+            <w:r>
+              <w:rPr>
+                <w:sz w:val="18"/>
+              </w:rPr>
+              <w:t>season_enc, day_name_enc, ad_channel_enc, holiday_name_enc</w:t>
+            </w:r>
+          </w:p>
+        </w:tc>
+      </w:tr>
+      <w:tr>
+        <w:tc>
+          <w:tcPr>
+            <w:tcW w:type="dxa" w:w="2551"/>
+            <w:shd w:fill="FFFFFF" w:val="clear"/>
+          </w:tcPr>
+          <w:p>
+            <w:r>
+              <w:rPr>
+                <w:sz w:val="18"/>
+              </w:rPr>
+              <w:t>known_reals</w:t>
+            </w:r>
+          </w:p>
+        </w:tc>
+        <w:tc>
+          <w:tcPr>
+            <w:tcW w:type="dxa" w:w="1134"/>
+            <w:shd w:fill="FFFFFF" w:val="clear"/>
+          </w:tcPr>
+          <w:p>
+            <w:r>
+              <w:rPr>
+                <w:sz w:val="18"/>
+              </w:rPr>
+              <w:t>28</w:t>
+            </w:r>
+          </w:p>
+        </w:tc>
+        <w:tc>
+          <w:tcPr>
+            <w:tcW w:type="dxa" w:w="2551"/>
+            <w:shd w:fill="FFFFFF" w:val="clear"/>
+          </w:tcPr>
+          <w:p>
+            <w:r>
+              <w:rPr>
+                <w:sz w:val="18"/>
+              </w:rPr>
+              <w:t>—</w:t>
+            </w:r>
+          </w:p>
+        </w:tc>
+        <w:tc>
+          <w:tcPr>
+            <w:tcW w:type="dxa" w:w="4252"/>
+            <w:shd w:fill="FFFFFF" w:val="clear"/>
+          </w:tcPr>
+          <w:p>
+            <w:r>
+              <w:rPr>
+                <w:sz w:val="18"/>
+              </w:rPr>
+              <w:t>Время (raw+sin/cos ×4), бинарные флаги (4), акции (4), цены топлива (7)</w:t>
+            </w:r>
+          </w:p>
+        </w:tc>
+      </w:tr>
+      <w:tr>
+        <w:tc>
+          <w:tcPr>
+            <w:tcW w:type="dxa" w:w="2551"/>
+            <w:shd w:fill="F2F2F2" w:val="clear"/>
+          </w:tcPr>
+          <w:p>
+            <w:r>
+              <w:rPr>
+                <w:sz w:val="18"/>
+              </w:rPr>
+              <w:t>relative_time_idx</w:t>
+            </w:r>
+          </w:p>
+        </w:tc>
+        <w:tc>
+          <w:tcPr>
+            <w:tcW w:type="dxa" w:w="1134"/>
+            <w:shd w:fill="F2F2F2" w:val="clear"/>
+          </w:tcPr>
+          <w:p>
+            <w:r>
+              <w:rPr>
+                <w:sz w:val="18"/>
+              </w:rPr>
+              <w:t>1</w:t>
+            </w:r>
+          </w:p>
+        </w:tc>
+        <w:tc>
+          <w:tcPr>
+            <w:tcW w:type="dxa" w:w="2551"/>
+            <w:shd w:fill="F2F2F2" w:val="clear"/>
+          </w:tcPr>
+          <w:p>
+            <w:r>
+              <w:rPr>
+                <w:sz w:val="18"/>
+              </w:rPr>
+              <w:t>add_relative_time_idx=True</w:t>
+            </w:r>
+          </w:p>
+        </w:tc>
+        <w:tc>
+          <w:tcPr>
+            <w:tcW w:type="dxa" w:w="4252"/>
+            <w:shd w:fill="F2F2F2" w:val="clear"/>
+          </w:tcPr>
+          <w:p>
+            <w:r>
+              <w:rPr>
+                <w:sz w:val="18"/>
+              </w:rPr>
+              <w:t>Позиция шага внутри окна (0 = начало, 1 = конец)</w:t>
+            </w:r>
+          </w:p>
+        </w:tc>
+      </w:tr>
+      <w:tr>
+        <w:tc>
+          <w:tcPr>
+            <w:tcW w:type="dxa" w:w="2551"/>
+            <w:shd w:fill="FFFFFF" w:val="clear"/>
+          </w:tcPr>
+          <w:p>
+            <w:r>
+              <w:rPr>
+                <w:sz w:val="18"/>
+              </w:rPr>
+              <w:t>unknown_reals</w:t>
+            </w:r>
+          </w:p>
+        </w:tc>
+        <w:tc>
+          <w:tcPr>
+            <w:tcW w:type="dxa" w:w="1134"/>
+            <w:shd w:fill="FFFFFF" w:val="clear"/>
+          </w:tcPr>
+          <w:p>
+            <w:r>
+              <w:rPr>
+                <w:sz w:val="18"/>
+              </w:rPr>
+              <w:t>19</w:t>
+            </w:r>
+          </w:p>
+        </w:tc>
+        <w:tc>
+          <w:tcPr>
+            <w:tcW w:type="dxa" w:w="2551"/>
+            <w:shd w:fill="FFFFFF" w:val="clear"/>
+          </w:tcPr>
+          <w:p>
+            <w:r>
+              <w:rPr>
+                <w:sz w:val="18"/>
+              </w:rPr>
+              <w:t>—</w:t>
+            </w:r>
+          </w:p>
+        </w:tc>
+        <w:tc>
+          <w:tcPr>
+            <w:tcW w:type="dxa" w:w="4252"/>
+            <w:shd w:fill="FFFFFF" w:val="clear"/>
+          </w:tcPr>
+          <w:p>
+            <w:r>
+              <w:rPr>
+                <w:sz w:val="18"/>
+              </w:rPr>
+              <w:t>Погода (8), трафик (7), выручка магазина (1), цены конкурентов (3)</w:t>
+            </w:r>
+          </w:p>
+        </w:tc>
+      </w:tr>
+      <w:tr>
+        <w:tc>
+          <w:tcPr>
+            <w:tcW w:type="dxa" w:w="2551"/>
+            <w:shd w:fill="F2F2F2" w:val="clear"/>
+          </w:tcPr>
+          <w:p>
+            <w:r>
+              <w:rPr>
+                <w:sz w:val="18"/>
+              </w:rPr>
+              <w:t>targets (observed past)</w:t>
+            </w:r>
+          </w:p>
+        </w:tc>
+        <w:tc>
+          <w:tcPr>
+            <w:tcW w:type="dxa" w:w="1134"/>
+            <w:shd w:fill="F2F2F2" w:val="clear"/>
+          </w:tcPr>
+          <w:p>
+            <w:r>
+              <w:rPr>
+                <w:sz w:val="18"/>
+              </w:rPr>
+              <w:t>12</w:t>
+            </w:r>
+          </w:p>
+        </w:tc>
+        <w:tc>
+          <w:tcPr>
+            <w:tcW w:type="dxa" w:w="2551"/>
+            <w:shd w:fill="F2F2F2" w:val="clear"/>
+          </w:tcPr>
+          <w:p>
+            <w:r>
+              <w:rPr>
+                <w:sz w:val="18"/>
+              </w:rPr>
+              <w:t>—</w:t>
+            </w:r>
+          </w:p>
+        </w:tc>
+        <w:tc>
+          <w:tcPr>
+            <w:tcW w:type="dxa" w:w="4252"/>
+            <w:shd w:fill="F2F2F2" w:val="clear"/>
+          </w:tcPr>
+          <w:p>
+            <w:r>
+              <w:rPr>
+                <w:sz w:val="18"/>
+              </w:rPr>
+              <w:t>12 целевых переменных — в энкодере видны как прошлые значения</w:t>
+            </w:r>
+          </w:p>
+        </w:tc>
+      </w:tr>
+      <w:tr>
+        <w:tc>
+          <w:tcPr>
+            <w:tcW w:type="dxa" w:w="2551"/>
+            <w:shd w:fill="FFFFFF" w:val="clear"/>
+          </w:tcPr>
+          <w:p>
+            <w:r>
+              <w:rPr>
+                <w:sz w:val="18"/>
+              </w:rPr>
+              <w:t>ИТОГО</w:t>
+            </w:r>
+          </w:p>
+        </w:tc>
+        <w:tc>
+          <w:tcPr>
+            <w:tcW w:type="dxa" w:w="1134"/>
+            <w:shd w:fill="FFFFFF" w:val="clear"/>
+          </w:tcPr>
+          <w:p>
+            <w:r>
+              <w:rPr>
+                <w:sz w:val="18"/>
+              </w:rPr>
+              <w:t>64</w:t>
+            </w:r>
+          </w:p>
+        </w:tc>
+        <w:tc>
+          <w:tcPr>
+            <w:tcW w:type="dxa" w:w="2551"/>
+            <w:shd w:fill="FFFFFF" w:val="clear"/>
+          </w:tcPr>
+          <w:p>
+            <w:r>
+              <w:rPr>
+                <w:sz w:val="18"/>
+              </w:rPr>
+              <w:t>—</w:t>
+            </w:r>
+          </w:p>
+        </w:tc>
+        <w:tc>
+          <w:tcPr>
+            <w:tcW w:type="dxa" w:w="4252"/>
+            <w:shd w:fill="FFFFFF" w:val="clear"/>
+          </w:tcPr>
+          <w:p>
+            <w:r>
+              <w:rPr>
+                <w:sz w:val="18"/>
+              </w:rPr>
+              <w:t>= 33 (известные) + 19 (наблюдаемые) + 12 (целевые прошлые)</w:t>
+            </w:r>
+          </w:p>
+        </w:tc>
+      </w:tr>
+    </w:tbl>
+    <w:p/>
+    <w:p>
+      <w:pPr>
+        <w:pStyle w:val="Heading3"/>
+      </w:pPr>
+      <w:r>
+        <w:rPr>
+          <w:color w:val="37868C"/>
+        </w:rPr>
+        <w:t>Будущие признаки (decoder_cont) — 33</w:t>
+      </w:r>
+    </w:p>
+    <w:tbl>
+      <w:tblPr>
+        <w:tblStyle w:val="TableGrid"/>
+        <w:tblW w:type="auto" w:w="0"/>
+        <w:jc w:val="left"/>
+        <w:tblLook w:firstColumn="1" w:firstRow="1" w:lastColumn="0" w:lastRow="0" w:noHBand="0" w:noVBand="1" w:val="04A0"/>
+      </w:tblPr>
+      <w:tblGrid>
+        <w:gridCol w:w="2422"/>
+        <w:gridCol w:w="2422"/>
+        <w:gridCol w:w="2422"/>
+        <w:gridCol w:w="2422"/>
+      </w:tblGrid>
+      <w:tr>
+        <w:tc>
+          <w:tcPr>
+            <w:tcW w:type="dxa" w:w="2551"/>
+            <w:shd w:fill="1F3964" w:val="clear"/>
+          </w:tcPr>
+          <w:p>
+            <w:r>
+              <w:rPr>
+                <w:b/>
+                <w:color w:val="FFFFFF"/>
+                <w:sz w:val="18"/>
+              </w:rPr>
+              <w:t>Компонент</w:t>
+            </w:r>
+          </w:p>
+        </w:tc>
+        <w:tc>
+          <w:tcPr>
+            <w:tcW w:type="dxa" w:w="1134"/>
+            <w:shd w:fill="1F3964" w:val="clear"/>
+          </w:tcPr>
+          <w:p>
+            <w:r>
+              <w:rPr>
+                <w:b/>
+                <w:color w:val="FFFFFF"/>
+                <w:sz w:val="18"/>
+              </w:rPr>
+              <w:t>Кол-во</w:t>
+            </w:r>
+          </w:p>
+        </w:tc>
+        <w:tc>
+          <w:tcPr>
+            <w:tcW w:type="dxa" w:w="2551"/>
+            <w:shd w:fill="1F3964" w:val="clear"/>
+          </w:tcPr>
+          <w:p>
+            <w:r>
+              <w:rPr>
+                <w:b/>
+                <w:color w:val="FFFFFF"/>
+                <w:sz w:val="18"/>
+              </w:rPr>
+              <w:t>Параметр датасета</w:t>
+            </w:r>
+          </w:p>
+        </w:tc>
+        <w:tc>
+          <w:tcPr>
+            <w:tcW w:type="dxa" w:w="4252"/>
+            <w:shd w:fill="1F3964" w:val="clear"/>
+          </w:tcPr>
+          <w:p>
+            <w:r>
+              <w:rPr>
+                <w:b/>
+                <w:color w:val="FFFFFF"/>
+                <w:sz w:val="18"/>
+              </w:rPr>
+              <w:t>Описание</w:t>
+            </w:r>
+          </w:p>
+        </w:tc>
+      </w:tr>
+      <w:tr>
+        <w:tc>
+          <w:tcPr>
+            <w:tcW w:type="dxa" w:w="2551"/>
+            <w:shd w:fill="F2F2F2" w:val="clear"/>
+          </w:tcPr>
+          <w:p>
+            <w:r>
+              <w:rPr>
+                <w:sz w:val="18"/>
+              </w:rPr>
+              <w:t>known_categoricals</w:t>
+            </w:r>
+          </w:p>
+        </w:tc>
+        <w:tc>
+          <w:tcPr>
+            <w:tcW w:type="dxa" w:w="1134"/>
+            <w:shd w:fill="F2F2F2" w:val="clear"/>
+          </w:tcPr>
+          <w:p>
+            <w:r>
+              <w:rPr>
+                <w:sz w:val="18"/>
+              </w:rPr>
+              <w:t>4</w:t>
+            </w:r>
+          </w:p>
+        </w:tc>
+        <w:tc>
+          <w:tcPr>
+            <w:tcW w:type="dxa" w:w="2551"/>
+            <w:shd w:fill="F2F2F2" w:val="clear"/>
+          </w:tcPr>
+          <w:p>
+            <w:r>
+              <w:rPr>
+                <w:sz w:val="18"/>
+              </w:rPr>
+              <w:t>—</w:t>
+            </w:r>
+          </w:p>
+        </w:tc>
+        <w:tc>
+          <w:tcPr>
+            <w:tcW w:type="dxa" w:w="4252"/>
+            <w:shd w:fill="F2F2F2" w:val="clear"/>
+          </w:tcPr>
+          <w:p>
+            <w:r>
+              <w:rPr>
+                <w:sz w:val="18"/>
+              </w:rPr>
+              <w:t>season_enc, day_name_enc, ad_channel_enc, holiday_name_enc</w:t>
+            </w:r>
+          </w:p>
+        </w:tc>
+      </w:tr>
+      <w:tr>
+        <w:tc>
+          <w:tcPr>
+            <w:tcW w:type="dxa" w:w="2551"/>
+            <w:shd w:fill="FFFFFF" w:val="clear"/>
+          </w:tcPr>
+          <w:p>
+            <w:r>
+              <w:rPr>
+                <w:sz w:val="18"/>
+              </w:rPr>
+              <w:t>known_reals</w:t>
+            </w:r>
+          </w:p>
+        </w:tc>
+        <w:tc>
+          <w:tcPr>
+            <w:tcW w:type="dxa" w:w="1134"/>
+            <w:shd w:fill="FFFFFF" w:val="clear"/>
+          </w:tcPr>
+          <w:p>
+            <w:r>
+              <w:rPr>
+                <w:sz w:val="18"/>
+              </w:rPr>
+              <w:t>28</w:t>
+            </w:r>
+          </w:p>
+        </w:tc>
+        <w:tc>
+          <w:tcPr>
+            <w:tcW w:type="dxa" w:w="2551"/>
+            <w:shd w:fill="FFFFFF" w:val="clear"/>
+          </w:tcPr>
+          <w:p>
+            <w:r>
+              <w:rPr>
+                <w:sz w:val="18"/>
+              </w:rPr>
+              <w:t>—</w:t>
+            </w:r>
+          </w:p>
+        </w:tc>
+        <w:tc>
+          <w:tcPr>
+            <w:tcW w:type="dxa" w:w="4252"/>
+            <w:shd w:fill="FFFFFF" w:val="clear"/>
+          </w:tcPr>
+          <w:p>
+            <w:r>
+              <w:rPr>
+                <w:sz w:val="18"/>
+              </w:rPr>
+              <w:t>Время (raw+sin/cos ×4), бинарные флаги (4), акции (4), цены топлива (7)</w:t>
+            </w:r>
+          </w:p>
+        </w:tc>
+      </w:tr>
+      <w:tr>
+        <w:tc>
+          <w:tcPr>
+            <w:tcW w:type="dxa" w:w="2551"/>
+            <w:shd w:fill="F2F2F2" w:val="clear"/>
+          </w:tcPr>
+          <w:p>
+            <w:r>
+              <w:rPr>
+                <w:sz w:val="18"/>
+              </w:rPr>
+              <w:t>relative_time_idx</w:t>
+            </w:r>
+          </w:p>
+        </w:tc>
+        <w:tc>
+          <w:tcPr>
+            <w:tcW w:type="dxa" w:w="1134"/>
+            <w:shd w:fill="F2F2F2" w:val="clear"/>
+          </w:tcPr>
+          <w:p>
+            <w:r>
+              <w:rPr>
+                <w:sz w:val="18"/>
+              </w:rPr>
+              <w:t>1</w:t>
+            </w:r>
+          </w:p>
+        </w:tc>
+        <w:tc>
+          <w:tcPr>
+            <w:tcW w:type="dxa" w:w="2551"/>
+            <w:shd w:fill="F2F2F2" w:val="clear"/>
+          </w:tcPr>
+          <w:p>
+            <w:r>
+              <w:rPr>
+                <w:sz w:val="18"/>
+              </w:rPr>
+              <w:t>add_relative_time_idx=True</w:t>
+            </w:r>
+          </w:p>
+        </w:tc>
+        <w:tc>
+          <w:tcPr>
+            <w:tcW w:type="dxa" w:w="4252"/>
+            <w:shd w:fill="F2F2F2" w:val="clear"/>
+          </w:tcPr>
+          <w:p>
+            <w:r>
+              <w:rPr>
+                <w:sz w:val="18"/>
+              </w:rPr>
+              <w:t>Позиция шага внутри горизонта прогноза</w:t>
+            </w:r>
+          </w:p>
+        </w:tc>
+      </w:tr>
+      <w:tr>
+        <w:tc>
+          <w:tcPr>
+            <w:tcW w:type="dxa" w:w="2551"/>
+            <w:shd w:fill="FFFFFF" w:val="clear"/>
+          </w:tcPr>
+          <w:p>
+            <w:r>
+              <w:rPr>
+                <w:sz w:val="18"/>
+              </w:rPr>
+              <w:t>ИТОГО</w:t>
+            </w:r>
+          </w:p>
+        </w:tc>
+        <w:tc>
+          <w:tcPr>
+            <w:tcW w:type="dxa" w:w="1134"/>
+            <w:shd w:fill="FFFFFF" w:val="clear"/>
+          </w:tcPr>
+          <w:p>
+            <w:r>
+              <w:rPr>
+                <w:sz w:val="18"/>
+              </w:rPr>
+              <w:t>33</w:t>
+            </w:r>
+          </w:p>
+        </w:tc>
+        <w:tc>
+          <w:tcPr>
+            <w:tcW w:type="dxa" w:w="2551"/>
+            <w:shd w:fill="FFFFFF" w:val="clear"/>
+          </w:tcPr>
+          <w:p>
+            <w:r>
+              <w:rPr>
+                <w:sz w:val="18"/>
+              </w:rPr>
+              <w:t>—</w:t>
+            </w:r>
+          </w:p>
+        </w:tc>
+        <w:tc>
+          <w:tcPr>
+            <w:tcW w:type="dxa" w:w="4252"/>
+            <w:shd w:fill="FFFFFF" w:val="clear"/>
+          </w:tcPr>
+          <w:p>
+            <w:r>
+              <w:rPr>
+                <w:sz w:val="18"/>
+              </w:rPr>
+              <w:t>Декодер видит только то, что можно знать заранее</w:t>
+            </w:r>
+          </w:p>
+        </w:tc>
+      </w:tr>
+    </w:tbl>
+    <w:p>
+      <w:r>
+        <w:rPr>
+          <w:b w:val="0"/>
+          <w:i w:val="0"/>
+          <w:sz w:val="20"/>
+        </w:rPr>
+        <w:t>Ключевое отличие: декодер (33) — это подмножество энкодера (64). В будущем нельзя наблюдать погоду, трафик и фактические продажи, поэтому unknown_reals и targets в decoder_cont отсутствуют. Именно это делает TFT мощнее классических seq2seq: модель явно разделяет, что ей известно заранее, а что — только по истории.</w:t>
+      </w:r>
+    </w:p>
     <w:sectPr>
       <w:pgSz w:w="12240" w:h="15840"/>
       <w:pgMar w:top="1134" w:right="1134" w:bottom="1134" w:left="1417" w:header="720" w:footer="720" w:gutter="0"/>

</xml_diff>